<commit_message>
Change of folder title from photos to scatter plots
</commit_message>
<xml_diff>
--- a/Project - Olga Ivashyna.docx
+++ b/Project - Olga Ivashyna.docx
@@ -6356,6 +6356,7 @@
           <w:szCs w:val="24"/>
           <w:shd w:fill="auto" w:val="clear"/>
         </w:rPr>
+        <w:t>Add note here on grades:</w:t>
       </w:r>
     </w:p>
     <w:p>
@@ -7300,7 +7301,8 @@
     <w:p>
       <w:pPr>
         <w:pStyle w:val="Normal"/>
-        <w:spacing w:lineRule="atLeast" w:line="228"/>
+        <w:bidi w:val="0"/>
+        <w:spacing w:lineRule="atLeast" w:line="228" w:before="0" w:after="0"/>
         <w:rPr>
           <w:rFonts w:ascii="Liberation Serif" w:hAnsi="Liberation Serif"/>
           <w:b w:val="false"/>
@@ -7320,6 +7322,18 @@
           <w:szCs w:val="24"/>
           <w:shd w:fill="auto" w:val="clear"/>
         </w:rPr>
+        <w:t xml:space="preserve"> </w:t>
+      </w:r>
+      <w:r>
+        <w:rPr>
+          <w:rFonts w:ascii="Liberation Serif" w:hAnsi="Liberation Serif"/>
+          <w:b w:val="false"/>
+          <w:color w:val="000000"/>
+          <w:sz w:val="24"/>
+          <w:szCs w:val="24"/>
+          <w:shd w:fill="auto" w:val="clear"/>
+        </w:rPr>
+        <w:t>Add note here on surrounding area:</w:t>
       </w:r>
     </w:p>
     <w:p>
@@ -8522,6 +8536,7 @@
           <w:szCs w:val="24"/>
           <w:shd w:fill="auto" w:val="clear"/>
         </w:rPr>
+        <w:t xml:space="preserve">For the correlation notes: </w:t>
       </w:r>
     </w:p>
     <w:p>
@@ -11463,6 +11478,7 @@
           <w:szCs w:val="24"/>
           <w:shd w:fill="auto" w:val="clear"/>
         </w:rPr>
+        <w:t xml:space="preserve">White people notes: </w:t>
       </w:r>
     </w:p>
     <w:p>
@@ -12940,6 +12956,7 @@
           <w:szCs w:val="24"/>
           <w:shd w:fill="auto" w:val="clear"/>
         </w:rPr>
+        <w:t xml:space="preserve">Notes on black people: </w:t>
       </w:r>
     </w:p>
     <w:p>
@@ -15201,6 +15218,7 @@
           <w:szCs w:val="24"/>
           <w:shd w:fill="auto" w:val="clear"/>
         </w:rPr>
+        <w:t>Notes on hispanic people:</w:t>
       </w:r>
     </w:p>
     <w:p>
@@ -17462,6 +17480,7 @@
           <w:szCs w:val="24"/>
           <w:shd w:fill="auto" w:val="clear"/>
         </w:rPr>
+        <w:t xml:space="preserve">Notes on asian people: </w:t>
       </w:r>
     </w:p>
     <w:p>
@@ -19723,6 +19742,7 @@
           <w:szCs w:val="24"/>
           <w:shd w:fill="auto" w:val="clear"/>
         </w:rPr>
+        <w:t xml:space="preserve">Notes on other people: </w:t>
       </w:r>
     </w:p>
     <w:p>
@@ -19761,35 +19781,3098 @@
           <w:szCs w:val="24"/>
           <w:shd w:fill="auto" w:val="clear"/>
         </w:rPr>
-      </w:r>
-    </w:p>
-    <w:p>
-      <w:pPr>
-        <w:pStyle w:val="Normal"/>
-        <w:spacing w:lineRule="atLeast" w:line="228"/>
-        <w:rPr>
-          <w:rFonts w:ascii="Liberation Serif" w:hAnsi="Liberation Serif"/>
-          <w:color w:val="000000"/>
-          <w:sz w:val="24"/>
-          <w:szCs w:val="24"/>
-          <w:highlight w:val="none"/>
-          <w:shd w:fill="auto" w:val="clear"/>
-        </w:rPr>
-      </w:pPr>
-      <w:r>
-        <w:rPr>
-          <w:rFonts w:ascii="Liberation Serif" w:hAnsi="Liberation Serif"/>
-          <w:color w:val="000000"/>
-          <w:sz w:val="24"/>
-          <w:szCs w:val="24"/>
-          <w:shd w:fill="auto" w:val="clear"/>
-        </w:rPr>
-      </w:r>
-    </w:p>
-    <w:p>
-      <w:pPr>
-        <w:pStyle w:val="Normal"/>
-        <w:spacing w:lineRule="atLeast" w:line="228"/>
+        <w:t xml:space="preserve">                  </w:t>
+      </w:r>
+      <w:r>
+        <w:rPr>
+          <w:rFonts w:ascii="Liberation Serif" w:hAnsi="Liberation Serif"/>
+          <w:color w:val="000000"/>
+          <w:sz w:val="24"/>
+          <w:szCs w:val="24"/>
+          <w:shd w:fill="auto" w:val="clear"/>
+        </w:rPr>
+        <w:t>Multivariate linear model</w:t>
+      </w:r>
+    </w:p>
+    <w:p>
+      <w:pPr>
+        <w:pStyle w:val="Normal"/>
+        <w:spacing w:lineRule="atLeast" w:line="228"/>
+        <w:rPr>
+          <w:rFonts w:ascii="Liberation Serif" w:hAnsi="Liberation Serif"/>
+          <w:color w:val="000000"/>
+          <w:sz w:val="24"/>
+          <w:szCs w:val="24"/>
+          <w:highlight w:val="none"/>
+          <w:shd w:fill="auto" w:val="clear"/>
+        </w:rPr>
+      </w:pPr>
+      <w:r>
+        <w:rPr>
+          <w:rFonts w:ascii="Liberation Serif" w:hAnsi="Liberation Serif"/>
+          <w:color w:val="000000"/>
+          <w:sz w:val="24"/>
+          <w:szCs w:val="24"/>
+          <w:shd w:fill="auto" w:val="clear"/>
+        </w:rPr>
+        <w:t>================================================================</w:t>
+      </w:r>
+    </w:p>
+    <w:p>
+      <w:pPr>
+        <w:pStyle w:val="Normal"/>
+        <w:spacing w:lineRule="atLeast" w:line="228"/>
+        <w:rPr>
+          <w:rFonts w:ascii="Liberation Serif" w:hAnsi="Liberation Serif"/>
+          <w:color w:val="000000"/>
+          <w:sz w:val="24"/>
+          <w:szCs w:val="24"/>
+          <w:highlight w:val="none"/>
+          <w:shd w:fill="auto" w:val="clear"/>
+        </w:rPr>
+      </w:pPr>
+      <w:r>
+        <w:rPr>
+          <w:rFonts w:ascii="Liberation Serif" w:hAnsi="Liberation Serif"/>
+          <w:color w:val="000000"/>
+          <w:sz w:val="24"/>
+          <w:szCs w:val="24"/>
+          <w:shd w:fill="auto" w:val="clear"/>
+        </w:rPr>
+        <w:t xml:space="preserve">                                                                </w:t>
+      </w:r>
+    </w:p>
+    <w:p>
+      <w:pPr>
+        <w:pStyle w:val="Normal"/>
+        <w:spacing w:lineRule="atLeast" w:line="228"/>
+        <w:rPr>
+          <w:rFonts w:ascii="Liberation Serif" w:hAnsi="Liberation Serif"/>
+          <w:color w:val="000000"/>
+          <w:sz w:val="24"/>
+          <w:szCs w:val="24"/>
+          <w:highlight w:val="none"/>
+          <w:shd w:fill="auto" w:val="clear"/>
+        </w:rPr>
+      </w:pPr>
+      <w:r>
+        <w:rPr>
+          <w:rFonts w:ascii="Liberation Serif" w:hAnsi="Liberation Serif"/>
+          <w:color w:val="000000"/>
+          <w:sz w:val="24"/>
+          <w:szCs w:val="24"/>
+          <w:shd w:fill="auto" w:val="clear"/>
+        </w:rPr>
+        <w:t>----------------------------------------------------------------</w:t>
+      </w:r>
+    </w:p>
+    <w:p>
+      <w:pPr>
+        <w:pStyle w:val="Normal"/>
+        <w:spacing w:lineRule="atLeast" w:line="228"/>
+        <w:rPr>
+          <w:rFonts w:ascii="Liberation Serif" w:hAnsi="Liberation Serif"/>
+          <w:color w:val="000000"/>
+          <w:sz w:val="24"/>
+          <w:szCs w:val="24"/>
+          <w:highlight w:val="none"/>
+          <w:shd w:fill="auto" w:val="clear"/>
+        </w:rPr>
+      </w:pPr>
+      <w:r>
+        <w:rPr>
+          <w:rFonts w:ascii="Liberation Serif" w:hAnsi="Liberation Serif"/>
+          <w:color w:val="000000"/>
+          <w:sz w:val="24"/>
+          <w:szCs w:val="24"/>
+          <w:shd w:fill="auto" w:val="clear"/>
+        </w:rPr>
+        <w:t xml:space="preserve">        </w:t>
+      </w:r>
+      <w:r>
+        <w:rPr>
+          <w:rFonts w:ascii="Liberation Serif" w:hAnsi="Liberation Serif"/>
+          <w:color w:val="000000"/>
+          <w:sz w:val="24"/>
+          <w:szCs w:val="24"/>
+          <w:shd w:fill="auto" w:val="clear"/>
+        </w:rPr>
+        <w:t>Intercept        Value  Num DF   Den DF  F Value  Pr &gt; F</w:t>
+      </w:r>
+    </w:p>
+    <w:p>
+      <w:pPr>
+        <w:pStyle w:val="Normal"/>
+        <w:spacing w:lineRule="atLeast" w:line="228"/>
+        <w:rPr>
+          <w:rFonts w:ascii="Liberation Serif" w:hAnsi="Liberation Serif"/>
+          <w:color w:val="000000"/>
+          <w:sz w:val="24"/>
+          <w:szCs w:val="24"/>
+          <w:highlight w:val="none"/>
+          <w:shd w:fill="auto" w:val="clear"/>
+        </w:rPr>
+      </w:pPr>
+      <w:r>
+        <w:rPr>
+          <w:rFonts w:ascii="Liberation Serif" w:hAnsi="Liberation Serif"/>
+          <w:color w:val="000000"/>
+          <w:sz w:val="24"/>
+          <w:szCs w:val="24"/>
+          <w:shd w:fill="auto" w:val="clear"/>
+        </w:rPr>
+        <w:t>----------------------------------------------------------------</w:t>
+      </w:r>
+    </w:p>
+    <w:p>
+      <w:pPr>
+        <w:pStyle w:val="Normal"/>
+        <w:spacing w:lineRule="atLeast" w:line="228"/>
+        <w:rPr>
+          <w:rFonts w:ascii="Liberation Serif" w:hAnsi="Liberation Serif"/>
+          <w:color w:val="000000"/>
+          <w:sz w:val="24"/>
+          <w:szCs w:val="24"/>
+          <w:highlight w:val="none"/>
+          <w:shd w:fill="auto" w:val="clear"/>
+        </w:rPr>
+      </w:pPr>
+      <w:r>
+        <w:rPr>
+          <w:rFonts w:ascii="Liberation Serif" w:hAnsi="Liberation Serif"/>
+          <w:color w:val="000000"/>
+          <w:sz w:val="24"/>
+          <w:szCs w:val="24"/>
+          <w:shd w:fill="auto" w:val="clear"/>
+        </w:rPr>
+        <w:t xml:space="preserve">           </w:t>
+      </w:r>
+      <w:r>
+        <w:rPr>
+          <w:rFonts w:ascii="Liberation Serif" w:hAnsi="Liberation Serif"/>
+          <w:color w:val="000000"/>
+          <w:sz w:val="24"/>
+          <w:szCs w:val="24"/>
+          <w:shd w:fill="auto" w:val="clear"/>
+        </w:rPr>
+        <w:t>Wilks' lambda 0.4487 5.0000 2063.0000 507.0113 0.0000</w:t>
+      </w:r>
+    </w:p>
+    <w:p>
+      <w:pPr>
+        <w:pStyle w:val="Normal"/>
+        <w:spacing w:lineRule="atLeast" w:line="228"/>
+        <w:rPr>
+          <w:rFonts w:ascii="Liberation Serif" w:hAnsi="Liberation Serif"/>
+          <w:color w:val="000000"/>
+          <w:sz w:val="24"/>
+          <w:szCs w:val="24"/>
+          <w:highlight w:val="none"/>
+          <w:shd w:fill="auto" w:val="clear"/>
+        </w:rPr>
+      </w:pPr>
+      <w:r>
+        <w:rPr>
+          <w:rFonts w:ascii="Liberation Serif" w:hAnsi="Liberation Serif"/>
+          <w:color w:val="000000"/>
+          <w:sz w:val="24"/>
+          <w:szCs w:val="24"/>
+          <w:shd w:fill="auto" w:val="clear"/>
+        </w:rPr>
+        <w:t xml:space="preserve">          </w:t>
+      </w:r>
+      <w:r>
+        <w:rPr>
+          <w:rFonts w:ascii="Liberation Serif" w:hAnsi="Liberation Serif"/>
+          <w:color w:val="000000"/>
+          <w:sz w:val="24"/>
+          <w:szCs w:val="24"/>
+          <w:shd w:fill="auto" w:val="clear"/>
+        </w:rPr>
+        <w:t>Pillai's trace 0.5513 5.0000 2063.0000 507.0113 0.0000</w:t>
+      </w:r>
+    </w:p>
+    <w:p>
+      <w:pPr>
+        <w:pStyle w:val="Normal"/>
+        <w:spacing w:lineRule="atLeast" w:line="228"/>
+        <w:rPr>
+          <w:rFonts w:ascii="Liberation Serif" w:hAnsi="Liberation Serif"/>
+          <w:color w:val="000000"/>
+          <w:sz w:val="24"/>
+          <w:szCs w:val="24"/>
+          <w:highlight w:val="none"/>
+          <w:shd w:fill="auto" w:val="clear"/>
+        </w:rPr>
+      </w:pPr>
+      <w:r>
+        <w:rPr>
+          <w:rFonts w:ascii="Liberation Serif" w:hAnsi="Liberation Serif"/>
+          <w:color w:val="000000"/>
+          <w:sz w:val="24"/>
+          <w:szCs w:val="24"/>
+          <w:shd w:fill="auto" w:val="clear"/>
+        </w:rPr>
+        <w:t xml:space="preserve">  </w:t>
+      </w:r>
+      <w:r>
+        <w:rPr>
+          <w:rFonts w:ascii="Liberation Serif" w:hAnsi="Liberation Serif"/>
+          <w:color w:val="000000"/>
+          <w:sz w:val="24"/>
+          <w:szCs w:val="24"/>
+          <w:shd w:fill="auto" w:val="clear"/>
+        </w:rPr>
+        <w:t>Hotelling-Lawley trace 1.2288 5.0000 2063.0000 507.0113 0.0000</w:t>
+      </w:r>
+    </w:p>
+    <w:p>
+      <w:pPr>
+        <w:pStyle w:val="Normal"/>
+        <w:spacing w:lineRule="atLeast" w:line="228"/>
+        <w:rPr>
+          <w:rFonts w:ascii="Liberation Serif" w:hAnsi="Liberation Serif"/>
+          <w:color w:val="000000"/>
+          <w:sz w:val="24"/>
+          <w:szCs w:val="24"/>
+          <w:highlight w:val="none"/>
+          <w:shd w:fill="auto" w:val="clear"/>
+        </w:rPr>
+      </w:pPr>
+      <w:r>
+        <w:rPr>
+          <w:rFonts w:ascii="Liberation Serif" w:hAnsi="Liberation Serif"/>
+          <w:color w:val="000000"/>
+          <w:sz w:val="24"/>
+          <w:szCs w:val="24"/>
+          <w:shd w:fill="auto" w:val="clear"/>
+        </w:rPr>
+        <w:t xml:space="preserve">     </w:t>
+      </w:r>
+      <w:r>
+        <w:rPr>
+          <w:rFonts w:ascii="Liberation Serif" w:hAnsi="Liberation Serif"/>
+          <w:color w:val="000000"/>
+          <w:sz w:val="24"/>
+          <w:szCs w:val="24"/>
+          <w:shd w:fill="auto" w:val="clear"/>
+        </w:rPr>
+        <w:t>Roy's greatest root 1.2288 5.0000 2063.0000 507.0113 0.0000</w:t>
+      </w:r>
+    </w:p>
+    <w:p>
+      <w:pPr>
+        <w:pStyle w:val="Normal"/>
+        <w:spacing w:lineRule="atLeast" w:line="228"/>
+        <w:rPr>
+          <w:rFonts w:ascii="Liberation Serif" w:hAnsi="Liberation Serif"/>
+          <w:color w:val="000000"/>
+          <w:sz w:val="24"/>
+          <w:szCs w:val="24"/>
+          <w:highlight w:val="none"/>
+          <w:shd w:fill="auto" w:val="clear"/>
+        </w:rPr>
+      </w:pPr>
+      <w:r>
+        <w:rPr>
+          <w:rFonts w:ascii="Liberation Serif" w:hAnsi="Liberation Serif"/>
+          <w:color w:val="000000"/>
+          <w:sz w:val="24"/>
+          <w:szCs w:val="24"/>
+          <w:shd w:fill="auto" w:val="clear"/>
+        </w:rPr>
+        <w:t>----------------------------------------------------------------</w:t>
+      </w:r>
+    </w:p>
+    <w:p>
+      <w:pPr>
+        <w:pStyle w:val="Normal"/>
+        <w:spacing w:lineRule="atLeast" w:line="228"/>
+        <w:rPr>
+          <w:rFonts w:ascii="Liberation Serif" w:hAnsi="Liberation Serif"/>
+          <w:color w:val="000000"/>
+          <w:sz w:val="24"/>
+          <w:szCs w:val="24"/>
+          <w:highlight w:val="none"/>
+          <w:shd w:fill="auto" w:val="clear"/>
+        </w:rPr>
+      </w:pPr>
+      <w:r>
+        <w:rPr>
+          <w:rFonts w:ascii="Liberation Serif" w:hAnsi="Liberation Serif"/>
+          <w:color w:val="000000"/>
+          <w:sz w:val="24"/>
+          <w:szCs w:val="24"/>
+          <w:shd w:fill="auto" w:val="clear"/>
+        </w:rPr>
+        <w:t xml:space="preserve">                                                                </w:t>
+      </w:r>
+    </w:p>
+    <w:p>
+      <w:pPr>
+        <w:pStyle w:val="Normal"/>
+        <w:spacing w:lineRule="atLeast" w:line="228"/>
+        <w:rPr>
+          <w:rFonts w:ascii="Liberation Serif" w:hAnsi="Liberation Serif"/>
+          <w:color w:val="000000"/>
+          <w:sz w:val="24"/>
+          <w:szCs w:val="24"/>
+          <w:highlight w:val="none"/>
+          <w:shd w:fill="auto" w:val="clear"/>
+        </w:rPr>
+      </w:pPr>
+      <w:r>
+        <w:rPr>
+          <w:rFonts w:ascii="Liberation Serif" w:hAnsi="Liberation Serif"/>
+          <w:color w:val="000000"/>
+          <w:sz w:val="24"/>
+          <w:szCs w:val="24"/>
+          <w:shd w:fill="auto" w:val="clear"/>
+        </w:rPr>
+        <w:t>----------------------------------------------------------------</w:t>
+      </w:r>
+    </w:p>
+    <w:p>
+      <w:pPr>
+        <w:pStyle w:val="Normal"/>
+        <w:spacing w:lineRule="atLeast" w:line="228"/>
+        <w:rPr>
+          <w:rFonts w:ascii="Liberation Serif" w:hAnsi="Liberation Serif"/>
+          <w:color w:val="000000"/>
+          <w:sz w:val="24"/>
+          <w:szCs w:val="24"/>
+          <w:highlight w:val="none"/>
+          <w:shd w:fill="auto" w:val="clear"/>
+        </w:rPr>
+      </w:pPr>
+      <w:r>
+        <w:rPr>
+          <w:rFonts w:ascii="Liberation Serif" w:hAnsi="Liberation Serif"/>
+          <w:color w:val="000000"/>
+          <w:sz w:val="24"/>
+          <w:szCs w:val="24"/>
+          <w:shd w:fill="auto" w:val="clear"/>
+        </w:rPr>
+        <w:t xml:space="preserve">      </w:t>
+      </w:r>
+      <w:r>
+        <w:rPr>
+          <w:rFonts w:ascii="Liberation Serif" w:hAnsi="Liberation Serif"/>
+          <w:color w:val="000000"/>
+          <w:sz w:val="24"/>
+          <w:szCs w:val="24"/>
+          <w:shd w:fill="auto" w:val="clear"/>
+        </w:rPr>
+        <w:t>holc_grade_x      Value   Num DF   Den DF  F Value  Pr &gt; F</w:t>
+      </w:r>
+    </w:p>
+    <w:p>
+      <w:pPr>
+        <w:pStyle w:val="Normal"/>
+        <w:spacing w:lineRule="atLeast" w:line="228"/>
+        <w:rPr>
+          <w:rFonts w:ascii="Liberation Serif" w:hAnsi="Liberation Serif"/>
+          <w:color w:val="000000"/>
+          <w:sz w:val="24"/>
+          <w:szCs w:val="24"/>
+          <w:highlight w:val="none"/>
+          <w:shd w:fill="auto" w:val="clear"/>
+        </w:rPr>
+      </w:pPr>
+      <w:r>
+        <w:rPr>
+          <w:rFonts w:ascii="Liberation Serif" w:hAnsi="Liberation Serif"/>
+          <w:color w:val="000000"/>
+          <w:sz w:val="24"/>
+          <w:szCs w:val="24"/>
+          <w:shd w:fill="auto" w:val="clear"/>
+        </w:rPr>
+        <w:t>----------------------------------------------------------------</w:t>
+      </w:r>
+    </w:p>
+    <w:p>
+      <w:pPr>
+        <w:pStyle w:val="Normal"/>
+        <w:spacing w:lineRule="atLeast" w:line="228"/>
+        <w:rPr>
+          <w:rFonts w:ascii="Liberation Serif" w:hAnsi="Liberation Serif"/>
+          <w:color w:val="000000"/>
+          <w:sz w:val="24"/>
+          <w:szCs w:val="24"/>
+          <w:highlight w:val="none"/>
+          <w:shd w:fill="auto" w:val="clear"/>
+        </w:rPr>
+      </w:pPr>
+      <w:r>
+        <w:rPr>
+          <w:rFonts w:ascii="Liberation Serif" w:hAnsi="Liberation Serif"/>
+          <w:color w:val="000000"/>
+          <w:sz w:val="24"/>
+          <w:szCs w:val="24"/>
+          <w:shd w:fill="auto" w:val="clear"/>
+        </w:rPr>
+        <w:t xml:space="preserve">          </w:t>
+      </w:r>
+      <w:r>
+        <w:rPr>
+          <w:rFonts w:ascii="Liberation Serif" w:hAnsi="Liberation Serif"/>
+          <w:color w:val="000000"/>
+          <w:sz w:val="24"/>
+          <w:szCs w:val="24"/>
+          <w:shd w:fill="auto" w:val="clear"/>
+        </w:rPr>
+        <w:t>Wilks' lambda 0.3993 15.0000 5695.4360 149.8146 0.0000</w:t>
+      </w:r>
+    </w:p>
+    <w:p>
+      <w:pPr>
+        <w:pStyle w:val="Normal"/>
+        <w:spacing w:lineRule="atLeast" w:line="228"/>
+        <w:rPr>
+          <w:rFonts w:ascii="Liberation Serif" w:hAnsi="Liberation Serif"/>
+          <w:color w:val="000000"/>
+          <w:sz w:val="24"/>
+          <w:szCs w:val="24"/>
+          <w:highlight w:val="none"/>
+          <w:shd w:fill="auto" w:val="clear"/>
+        </w:rPr>
+      </w:pPr>
+      <w:r>
+        <w:rPr>
+          <w:rFonts w:ascii="Liberation Serif" w:hAnsi="Liberation Serif"/>
+          <w:color w:val="000000"/>
+          <w:sz w:val="24"/>
+          <w:szCs w:val="24"/>
+          <w:shd w:fill="auto" w:val="clear"/>
+        </w:rPr>
+        <w:t xml:space="preserve">         </w:t>
+      </w:r>
+      <w:r>
+        <w:rPr>
+          <w:rFonts w:ascii="Liberation Serif" w:hAnsi="Liberation Serif"/>
+          <w:color w:val="000000"/>
+          <w:sz w:val="24"/>
+          <w:szCs w:val="24"/>
+          <w:shd w:fill="auto" w:val="clear"/>
+        </w:rPr>
+        <w:t>Pillai's trace 0.6246 15.0000 6195.0000 108.6065 0.0000</w:t>
+      </w:r>
+    </w:p>
+    <w:p>
+      <w:pPr>
+        <w:pStyle w:val="Normal"/>
+        <w:spacing w:lineRule="atLeast" w:line="228"/>
+        <w:rPr>
+          <w:rFonts w:ascii="Liberation Serif" w:hAnsi="Liberation Serif"/>
+          <w:color w:val="000000"/>
+          <w:sz w:val="24"/>
+          <w:szCs w:val="24"/>
+          <w:highlight w:val="none"/>
+          <w:shd w:fill="auto" w:val="clear"/>
+        </w:rPr>
+      </w:pPr>
+      <w:r>
+        <w:rPr>
+          <w:rFonts w:ascii="Liberation Serif" w:hAnsi="Liberation Serif"/>
+          <w:color w:val="000000"/>
+          <w:sz w:val="24"/>
+          <w:szCs w:val="24"/>
+          <w:shd w:fill="auto" w:val="clear"/>
+        </w:rPr>
+        <w:t xml:space="preserve"> </w:t>
+      </w:r>
+      <w:r>
+        <w:rPr>
+          <w:rFonts w:ascii="Liberation Serif" w:hAnsi="Liberation Serif"/>
+          <w:color w:val="000000"/>
+          <w:sz w:val="24"/>
+          <w:szCs w:val="24"/>
+          <w:shd w:fill="auto" w:val="clear"/>
+        </w:rPr>
+        <w:t>Hotelling-Lawley trace 1.4448 15.0000 3891.5464 198.6232 0.0000</w:t>
+      </w:r>
+    </w:p>
+    <w:p>
+      <w:pPr>
+        <w:pStyle w:val="Normal"/>
+        <w:spacing w:lineRule="atLeast" w:line="228"/>
+        <w:rPr>
+          <w:rFonts w:ascii="Liberation Serif" w:hAnsi="Liberation Serif"/>
+          <w:color w:val="000000"/>
+          <w:sz w:val="24"/>
+          <w:szCs w:val="24"/>
+          <w:highlight w:val="none"/>
+          <w:shd w:fill="auto" w:val="clear"/>
+        </w:rPr>
+      </w:pPr>
+      <w:r>
+        <w:rPr>
+          <w:rFonts w:ascii="Liberation Serif" w:hAnsi="Liberation Serif"/>
+          <w:color w:val="000000"/>
+          <w:sz w:val="24"/>
+          <w:szCs w:val="24"/>
+          <w:shd w:fill="auto" w:val="clear"/>
+        </w:rPr>
+        <w:t xml:space="preserve">    </w:t>
+      </w:r>
+      <w:r>
+        <w:rPr>
+          <w:rFonts w:ascii="Liberation Serif" w:hAnsi="Liberation Serif"/>
+          <w:color w:val="000000"/>
+          <w:sz w:val="24"/>
+          <w:szCs w:val="24"/>
+          <w:shd w:fill="auto" w:val="clear"/>
+        </w:rPr>
+        <w:t>Roy's greatest root 1.4025  5.0000 2065.0000 579.2258 0.0000</w:t>
+      </w:r>
+    </w:p>
+    <w:p>
+      <w:pPr>
+        <w:pStyle w:val="Normal"/>
+        <w:spacing w:lineRule="atLeast" w:line="228"/>
+        <w:rPr>
+          <w:rFonts w:ascii="Liberation Serif" w:hAnsi="Liberation Serif"/>
+          <w:color w:val="000000"/>
+          <w:sz w:val="24"/>
+          <w:szCs w:val="24"/>
+          <w:highlight w:val="none"/>
+          <w:shd w:fill="auto" w:val="clear"/>
+        </w:rPr>
+      </w:pPr>
+      <w:r>
+        <w:rPr>
+          <w:rFonts w:ascii="Liberation Serif" w:hAnsi="Liberation Serif"/>
+          <w:color w:val="000000"/>
+          <w:sz w:val="24"/>
+          <w:szCs w:val="24"/>
+          <w:shd w:fill="auto" w:val="clear"/>
+        </w:rPr>
+        <w:t>----------------------------------------------------------------</w:t>
+      </w:r>
+    </w:p>
+    <w:p>
+      <w:pPr>
+        <w:pStyle w:val="Normal"/>
+        <w:spacing w:lineRule="atLeast" w:line="228"/>
+        <w:rPr>
+          <w:rFonts w:ascii="Liberation Serif" w:hAnsi="Liberation Serif"/>
+          <w:color w:val="000000"/>
+          <w:sz w:val="24"/>
+          <w:szCs w:val="24"/>
+          <w:highlight w:val="none"/>
+          <w:shd w:fill="auto" w:val="clear"/>
+        </w:rPr>
+      </w:pPr>
+      <w:r>
+        <w:rPr>
+          <w:rFonts w:ascii="Liberation Serif" w:hAnsi="Liberation Serif"/>
+          <w:color w:val="000000"/>
+          <w:sz w:val="24"/>
+          <w:szCs w:val="24"/>
+          <w:shd w:fill="auto" w:val="clear"/>
+        </w:rPr>
+        <w:t xml:space="preserve">                                                                </w:t>
+      </w:r>
+    </w:p>
+    <w:p>
+      <w:pPr>
+        <w:pStyle w:val="Normal"/>
+        <w:spacing w:lineRule="atLeast" w:line="228"/>
+        <w:rPr>
+          <w:rFonts w:ascii="Liberation Serif" w:hAnsi="Liberation Serif"/>
+          <w:color w:val="000000"/>
+          <w:sz w:val="24"/>
+          <w:szCs w:val="24"/>
+          <w:highlight w:val="none"/>
+          <w:shd w:fill="auto" w:val="clear"/>
+        </w:rPr>
+      </w:pPr>
+      <w:r>
+        <w:rPr>
+          <w:rFonts w:ascii="Liberation Serif" w:hAnsi="Liberation Serif"/>
+          <w:color w:val="000000"/>
+          <w:sz w:val="24"/>
+          <w:szCs w:val="24"/>
+          <w:shd w:fill="auto" w:val="clear"/>
+        </w:rPr>
+        <w:t>----------------------------------------------------------------</w:t>
+      </w:r>
+    </w:p>
+    <w:p>
+      <w:pPr>
+        <w:pStyle w:val="Normal"/>
+        <w:spacing w:lineRule="atLeast" w:line="228"/>
+        <w:rPr>
+          <w:rFonts w:ascii="Liberation Serif" w:hAnsi="Liberation Serif"/>
+          <w:color w:val="000000"/>
+          <w:sz w:val="24"/>
+          <w:szCs w:val="24"/>
+          <w:highlight w:val="none"/>
+          <w:shd w:fill="auto" w:val="clear"/>
+        </w:rPr>
+      </w:pPr>
+      <w:r>
+        <w:rPr>
+          <w:rFonts w:ascii="Liberation Serif" w:hAnsi="Liberation Serif"/>
+          <w:color w:val="000000"/>
+          <w:sz w:val="24"/>
+          <w:szCs w:val="24"/>
+          <w:shd w:fill="auto" w:val="clear"/>
+        </w:rPr>
+        <w:t xml:space="preserve">    </w:t>
+      </w:r>
+      <w:r>
+        <w:rPr>
+          <w:rFonts w:ascii="Liberation Serif" w:hAnsi="Liberation Serif"/>
+          <w:color w:val="000000"/>
+          <w:sz w:val="24"/>
+          <w:szCs w:val="24"/>
+          <w:shd w:fill="auto" w:val="clear"/>
+        </w:rPr>
+        <w:t>surr_area_pct_white   Value  Num DF   Den DF  F Value Pr &gt; F</w:t>
+      </w:r>
+    </w:p>
+    <w:p>
+      <w:pPr>
+        <w:pStyle w:val="Normal"/>
+        <w:spacing w:lineRule="atLeast" w:line="228"/>
+        <w:rPr>
+          <w:rFonts w:ascii="Liberation Serif" w:hAnsi="Liberation Serif"/>
+          <w:color w:val="000000"/>
+          <w:sz w:val="24"/>
+          <w:szCs w:val="24"/>
+          <w:highlight w:val="none"/>
+          <w:shd w:fill="auto" w:val="clear"/>
+        </w:rPr>
+      </w:pPr>
+      <w:r>
+        <w:rPr>
+          <w:rFonts w:ascii="Liberation Serif" w:hAnsi="Liberation Serif"/>
+          <w:color w:val="000000"/>
+          <w:sz w:val="24"/>
+          <w:szCs w:val="24"/>
+          <w:shd w:fill="auto" w:val="clear"/>
+        </w:rPr>
+        <w:t>----------------------------------------------------------------</w:t>
+      </w:r>
+    </w:p>
+    <w:p>
+      <w:pPr>
+        <w:pStyle w:val="Normal"/>
+        <w:spacing w:lineRule="atLeast" w:line="228"/>
+        <w:rPr>
+          <w:rFonts w:ascii="Liberation Serif" w:hAnsi="Liberation Serif"/>
+          <w:color w:val="000000"/>
+          <w:sz w:val="24"/>
+          <w:szCs w:val="24"/>
+          <w:highlight w:val="none"/>
+          <w:shd w:fill="auto" w:val="clear"/>
+        </w:rPr>
+      </w:pPr>
+      <w:r>
+        <w:rPr>
+          <w:rFonts w:ascii="Liberation Serif" w:hAnsi="Liberation Serif"/>
+          <w:color w:val="000000"/>
+          <w:sz w:val="24"/>
+          <w:szCs w:val="24"/>
+          <w:shd w:fill="auto" w:val="clear"/>
+        </w:rPr>
+        <w:t xml:space="preserve">            </w:t>
+      </w:r>
+      <w:r>
+        <w:rPr>
+          <w:rFonts w:ascii="Liberation Serif" w:hAnsi="Liberation Serif"/>
+          <w:color w:val="000000"/>
+          <w:sz w:val="24"/>
+          <w:szCs w:val="24"/>
+          <w:shd w:fill="auto" w:val="clear"/>
+        </w:rPr>
+        <w:t>Wilks' lambda 0.9804 5.0000 2063.0000  8.2452 0.0000</w:t>
+      </w:r>
+    </w:p>
+    <w:p>
+      <w:pPr>
+        <w:pStyle w:val="Normal"/>
+        <w:spacing w:lineRule="atLeast" w:line="228"/>
+        <w:rPr>
+          <w:rFonts w:ascii="Liberation Serif" w:hAnsi="Liberation Serif"/>
+          <w:color w:val="000000"/>
+          <w:sz w:val="24"/>
+          <w:szCs w:val="24"/>
+          <w:highlight w:val="none"/>
+          <w:shd w:fill="auto" w:val="clear"/>
+        </w:rPr>
+      </w:pPr>
+      <w:r>
+        <w:rPr>
+          <w:rFonts w:ascii="Liberation Serif" w:hAnsi="Liberation Serif"/>
+          <w:color w:val="000000"/>
+          <w:sz w:val="24"/>
+          <w:szCs w:val="24"/>
+          <w:shd w:fill="auto" w:val="clear"/>
+        </w:rPr>
+        <w:t xml:space="preserve">           </w:t>
+      </w:r>
+      <w:r>
+        <w:rPr>
+          <w:rFonts w:ascii="Liberation Serif" w:hAnsi="Liberation Serif"/>
+          <w:color w:val="000000"/>
+          <w:sz w:val="24"/>
+          <w:szCs w:val="24"/>
+          <w:shd w:fill="auto" w:val="clear"/>
+        </w:rPr>
+        <w:t>Pillai's trace 0.0196 5.0000 2063.0000  8.2452 0.0000</w:t>
+      </w:r>
+    </w:p>
+    <w:p>
+      <w:pPr>
+        <w:pStyle w:val="Normal"/>
+        <w:spacing w:lineRule="atLeast" w:line="228"/>
+        <w:rPr>
+          <w:rFonts w:ascii="Liberation Serif" w:hAnsi="Liberation Serif"/>
+          <w:color w:val="000000"/>
+          <w:sz w:val="24"/>
+          <w:szCs w:val="24"/>
+          <w:highlight w:val="none"/>
+          <w:shd w:fill="auto" w:val="clear"/>
+        </w:rPr>
+      </w:pPr>
+      <w:r>
+        <w:rPr>
+          <w:rFonts w:ascii="Liberation Serif" w:hAnsi="Liberation Serif"/>
+          <w:color w:val="000000"/>
+          <w:sz w:val="24"/>
+          <w:szCs w:val="24"/>
+          <w:shd w:fill="auto" w:val="clear"/>
+        </w:rPr>
+        <w:t xml:space="preserve">   </w:t>
+      </w:r>
+      <w:r>
+        <w:rPr>
+          <w:rFonts w:ascii="Liberation Serif" w:hAnsi="Liberation Serif"/>
+          <w:color w:val="000000"/>
+          <w:sz w:val="24"/>
+          <w:szCs w:val="24"/>
+          <w:shd w:fill="auto" w:val="clear"/>
+        </w:rPr>
+        <w:t>Hotelling-Lawley trace 0.0200 5.0000 2063.0000  8.2452 0.0000</w:t>
+      </w:r>
+    </w:p>
+    <w:p>
+      <w:pPr>
+        <w:pStyle w:val="Normal"/>
+        <w:spacing w:lineRule="atLeast" w:line="228"/>
+        <w:rPr>
+          <w:rFonts w:ascii="Liberation Serif" w:hAnsi="Liberation Serif"/>
+          <w:color w:val="000000"/>
+          <w:sz w:val="24"/>
+          <w:szCs w:val="24"/>
+          <w:highlight w:val="none"/>
+          <w:shd w:fill="auto" w:val="clear"/>
+        </w:rPr>
+      </w:pPr>
+      <w:r>
+        <w:rPr>
+          <w:rFonts w:ascii="Liberation Serif" w:hAnsi="Liberation Serif"/>
+          <w:color w:val="000000"/>
+          <w:sz w:val="24"/>
+          <w:szCs w:val="24"/>
+          <w:shd w:fill="auto" w:val="clear"/>
+        </w:rPr>
+        <w:t xml:space="preserve">      </w:t>
+      </w:r>
+      <w:r>
+        <w:rPr>
+          <w:rFonts w:ascii="Liberation Serif" w:hAnsi="Liberation Serif"/>
+          <w:color w:val="000000"/>
+          <w:sz w:val="24"/>
+          <w:szCs w:val="24"/>
+          <w:shd w:fill="auto" w:val="clear"/>
+        </w:rPr>
+        <w:t>Roy's greatest root 0.0200 5.0000 2063.0000  8.2452 0.0000</w:t>
+      </w:r>
+    </w:p>
+    <w:p>
+      <w:pPr>
+        <w:pStyle w:val="Normal"/>
+        <w:spacing w:lineRule="atLeast" w:line="228"/>
+        <w:rPr>
+          <w:rFonts w:ascii="Liberation Serif" w:hAnsi="Liberation Serif"/>
+          <w:color w:val="000000"/>
+          <w:sz w:val="24"/>
+          <w:szCs w:val="24"/>
+          <w:highlight w:val="none"/>
+          <w:shd w:fill="auto" w:val="clear"/>
+        </w:rPr>
+      </w:pPr>
+      <w:r>
+        <w:rPr>
+          <w:rFonts w:ascii="Liberation Serif" w:hAnsi="Liberation Serif"/>
+          <w:color w:val="000000"/>
+          <w:sz w:val="24"/>
+          <w:szCs w:val="24"/>
+          <w:shd w:fill="auto" w:val="clear"/>
+        </w:rPr>
+        <w:t>----------------------------------------------------------------</w:t>
+      </w:r>
+    </w:p>
+    <w:p>
+      <w:pPr>
+        <w:pStyle w:val="Normal"/>
+        <w:spacing w:lineRule="atLeast" w:line="228"/>
+        <w:rPr>
+          <w:rFonts w:ascii="Liberation Serif" w:hAnsi="Liberation Serif"/>
+          <w:color w:val="000000"/>
+          <w:sz w:val="24"/>
+          <w:szCs w:val="24"/>
+          <w:highlight w:val="none"/>
+          <w:shd w:fill="auto" w:val="clear"/>
+        </w:rPr>
+      </w:pPr>
+      <w:r>
+        <w:rPr>
+          <w:rFonts w:ascii="Liberation Serif" w:hAnsi="Liberation Serif"/>
+          <w:color w:val="000000"/>
+          <w:sz w:val="24"/>
+          <w:szCs w:val="24"/>
+          <w:shd w:fill="auto" w:val="clear"/>
+        </w:rPr>
+        <w:t xml:space="preserve">                                                                </w:t>
+      </w:r>
+    </w:p>
+    <w:p>
+      <w:pPr>
+        <w:pStyle w:val="Normal"/>
+        <w:spacing w:lineRule="atLeast" w:line="228"/>
+        <w:rPr>
+          <w:rFonts w:ascii="Liberation Serif" w:hAnsi="Liberation Serif"/>
+          <w:color w:val="000000"/>
+          <w:sz w:val="24"/>
+          <w:szCs w:val="24"/>
+          <w:highlight w:val="none"/>
+          <w:shd w:fill="auto" w:val="clear"/>
+        </w:rPr>
+      </w:pPr>
+      <w:r>
+        <w:rPr>
+          <w:rFonts w:ascii="Liberation Serif" w:hAnsi="Liberation Serif"/>
+          <w:color w:val="000000"/>
+          <w:sz w:val="24"/>
+          <w:szCs w:val="24"/>
+          <w:shd w:fill="auto" w:val="clear"/>
+        </w:rPr>
+        <w:t>----------------------------------------------------------------</w:t>
+      </w:r>
+    </w:p>
+    <w:p>
+      <w:pPr>
+        <w:pStyle w:val="Normal"/>
+        <w:spacing w:lineRule="atLeast" w:line="228"/>
+        <w:rPr>
+          <w:rFonts w:ascii="Liberation Serif" w:hAnsi="Liberation Serif"/>
+          <w:color w:val="000000"/>
+          <w:sz w:val="24"/>
+          <w:szCs w:val="24"/>
+          <w:highlight w:val="none"/>
+          <w:shd w:fill="auto" w:val="clear"/>
+        </w:rPr>
+      </w:pPr>
+      <w:r>
+        <w:rPr>
+          <w:rFonts w:ascii="Liberation Serif" w:hAnsi="Liberation Serif"/>
+          <w:color w:val="000000"/>
+          <w:sz w:val="24"/>
+          <w:szCs w:val="24"/>
+          <w:shd w:fill="auto" w:val="clear"/>
+        </w:rPr>
+        <w:t xml:space="preserve">    </w:t>
+      </w:r>
+      <w:r>
+        <w:rPr>
+          <w:rFonts w:ascii="Liberation Serif" w:hAnsi="Liberation Serif"/>
+          <w:color w:val="000000"/>
+          <w:sz w:val="24"/>
+          <w:szCs w:val="24"/>
+          <w:shd w:fill="auto" w:val="clear"/>
+        </w:rPr>
+        <w:t>surr_area_pct_black   Value  Num DF   Den DF  F Value Pr &gt; F</w:t>
+      </w:r>
+    </w:p>
+    <w:p>
+      <w:pPr>
+        <w:pStyle w:val="Normal"/>
+        <w:spacing w:lineRule="atLeast" w:line="228"/>
+        <w:rPr>
+          <w:rFonts w:ascii="Liberation Serif" w:hAnsi="Liberation Serif"/>
+          <w:color w:val="000000"/>
+          <w:sz w:val="24"/>
+          <w:szCs w:val="24"/>
+          <w:highlight w:val="none"/>
+          <w:shd w:fill="auto" w:val="clear"/>
+        </w:rPr>
+      </w:pPr>
+      <w:r>
+        <w:rPr>
+          <w:rFonts w:ascii="Liberation Serif" w:hAnsi="Liberation Serif"/>
+          <w:color w:val="000000"/>
+          <w:sz w:val="24"/>
+          <w:szCs w:val="24"/>
+          <w:shd w:fill="auto" w:val="clear"/>
+        </w:rPr>
+        <w:t>----------------------------------------------------------------</w:t>
+      </w:r>
+    </w:p>
+    <w:p>
+      <w:pPr>
+        <w:pStyle w:val="Normal"/>
+        <w:spacing w:lineRule="atLeast" w:line="228"/>
+        <w:rPr>
+          <w:rFonts w:ascii="Liberation Serif" w:hAnsi="Liberation Serif"/>
+          <w:color w:val="000000"/>
+          <w:sz w:val="24"/>
+          <w:szCs w:val="24"/>
+          <w:highlight w:val="none"/>
+          <w:shd w:fill="auto" w:val="clear"/>
+        </w:rPr>
+      </w:pPr>
+      <w:r>
+        <w:rPr>
+          <w:rFonts w:ascii="Liberation Serif" w:hAnsi="Liberation Serif"/>
+          <w:color w:val="000000"/>
+          <w:sz w:val="24"/>
+          <w:szCs w:val="24"/>
+          <w:shd w:fill="auto" w:val="clear"/>
+        </w:rPr>
+        <w:t xml:space="preserve">            </w:t>
+      </w:r>
+      <w:r>
+        <w:rPr>
+          <w:rFonts w:ascii="Liberation Serif" w:hAnsi="Liberation Serif"/>
+          <w:color w:val="000000"/>
+          <w:sz w:val="24"/>
+          <w:szCs w:val="24"/>
+          <w:shd w:fill="auto" w:val="clear"/>
+        </w:rPr>
+        <w:t>Wilks' lambda 0.9805 5.0000 2063.0000  8.2166 0.0000</w:t>
+      </w:r>
+    </w:p>
+    <w:p>
+      <w:pPr>
+        <w:pStyle w:val="Normal"/>
+        <w:spacing w:lineRule="atLeast" w:line="228"/>
+        <w:rPr>
+          <w:rFonts w:ascii="Liberation Serif" w:hAnsi="Liberation Serif"/>
+          <w:color w:val="000000"/>
+          <w:sz w:val="24"/>
+          <w:szCs w:val="24"/>
+          <w:highlight w:val="none"/>
+          <w:shd w:fill="auto" w:val="clear"/>
+        </w:rPr>
+      </w:pPr>
+      <w:r>
+        <w:rPr>
+          <w:rFonts w:ascii="Liberation Serif" w:hAnsi="Liberation Serif"/>
+          <w:color w:val="000000"/>
+          <w:sz w:val="24"/>
+          <w:szCs w:val="24"/>
+          <w:shd w:fill="auto" w:val="clear"/>
+        </w:rPr>
+        <w:t xml:space="preserve">           </w:t>
+      </w:r>
+      <w:r>
+        <w:rPr>
+          <w:rFonts w:ascii="Liberation Serif" w:hAnsi="Liberation Serif"/>
+          <w:color w:val="000000"/>
+          <w:sz w:val="24"/>
+          <w:szCs w:val="24"/>
+          <w:shd w:fill="auto" w:val="clear"/>
+        </w:rPr>
+        <w:t>Pillai's trace 0.0195 5.0000 2063.0000  8.2166 0.0000</w:t>
+      </w:r>
+    </w:p>
+    <w:p>
+      <w:pPr>
+        <w:pStyle w:val="Normal"/>
+        <w:spacing w:lineRule="atLeast" w:line="228"/>
+        <w:rPr>
+          <w:rFonts w:ascii="Liberation Serif" w:hAnsi="Liberation Serif"/>
+          <w:color w:val="000000"/>
+          <w:sz w:val="24"/>
+          <w:szCs w:val="24"/>
+          <w:highlight w:val="none"/>
+          <w:shd w:fill="auto" w:val="clear"/>
+        </w:rPr>
+      </w:pPr>
+      <w:r>
+        <w:rPr>
+          <w:rFonts w:ascii="Liberation Serif" w:hAnsi="Liberation Serif"/>
+          <w:color w:val="000000"/>
+          <w:sz w:val="24"/>
+          <w:szCs w:val="24"/>
+          <w:shd w:fill="auto" w:val="clear"/>
+        </w:rPr>
+        <w:t xml:space="preserve">   </w:t>
+      </w:r>
+      <w:r>
+        <w:rPr>
+          <w:rFonts w:ascii="Liberation Serif" w:hAnsi="Liberation Serif"/>
+          <w:color w:val="000000"/>
+          <w:sz w:val="24"/>
+          <w:szCs w:val="24"/>
+          <w:shd w:fill="auto" w:val="clear"/>
+        </w:rPr>
+        <w:t>Hotelling-Lawley trace 0.0199 5.0000 2063.0000  8.2166 0.0000</w:t>
+      </w:r>
+    </w:p>
+    <w:p>
+      <w:pPr>
+        <w:pStyle w:val="Normal"/>
+        <w:spacing w:lineRule="atLeast" w:line="228"/>
+        <w:rPr>
+          <w:rFonts w:ascii="Liberation Serif" w:hAnsi="Liberation Serif"/>
+          <w:color w:val="000000"/>
+          <w:sz w:val="24"/>
+          <w:szCs w:val="24"/>
+          <w:highlight w:val="none"/>
+          <w:shd w:fill="auto" w:val="clear"/>
+        </w:rPr>
+      </w:pPr>
+      <w:r>
+        <w:rPr>
+          <w:rFonts w:ascii="Liberation Serif" w:hAnsi="Liberation Serif"/>
+          <w:color w:val="000000"/>
+          <w:sz w:val="24"/>
+          <w:szCs w:val="24"/>
+          <w:shd w:fill="auto" w:val="clear"/>
+        </w:rPr>
+        <w:t xml:space="preserve">      </w:t>
+      </w:r>
+      <w:r>
+        <w:rPr>
+          <w:rFonts w:ascii="Liberation Serif" w:hAnsi="Liberation Serif"/>
+          <w:color w:val="000000"/>
+          <w:sz w:val="24"/>
+          <w:szCs w:val="24"/>
+          <w:shd w:fill="auto" w:val="clear"/>
+        </w:rPr>
+        <w:t>Roy's greatest root 0.0199 5.0000 2063.0000  8.2166 0.0000</w:t>
+      </w:r>
+    </w:p>
+    <w:p>
+      <w:pPr>
+        <w:pStyle w:val="Normal"/>
+        <w:spacing w:lineRule="atLeast" w:line="228"/>
+        <w:rPr>
+          <w:rFonts w:ascii="Liberation Serif" w:hAnsi="Liberation Serif"/>
+          <w:color w:val="000000"/>
+          <w:sz w:val="24"/>
+          <w:szCs w:val="24"/>
+          <w:highlight w:val="none"/>
+          <w:shd w:fill="auto" w:val="clear"/>
+        </w:rPr>
+      </w:pPr>
+      <w:r>
+        <w:rPr>
+          <w:rFonts w:ascii="Liberation Serif" w:hAnsi="Liberation Serif"/>
+          <w:color w:val="000000"/>
+          <w:sz w:val="24"/>
+          <w:szCs w:val="24"/>
+          <w:shd w:fill="auto" w:val="clear"/>
+        </w:rPr>
+        <w:t>----------------------------------------------------------------</w:t>
+      </w:r>
+    </w:p>
+    <w:p>
+      <w:pPr>
+        <w:pStyle w:val="Normal"/>
+        <w:spacing w:lineRule="atLeast" w:line="228"/>
+        <w:rPr>
+          <w:rFonts w:ascii="Liberation Serif" w:hAnsi="Liberation Serif"/>
+          <w:color w:val="000000"/>
+          <w:sz w:val="24"/>
+          <w:szCs w:val="24"/>
+          <w:highlight w:val="none"/>
+          <w:shd w:fill="auto" w:val="clear"/>
+        </w:rPr>
+      </w:pPr>
+      <w:r>
+        <w:rPr>
+          <w:rFonts w:ascii="Liberation Serif" w:hAnsi="Liberation Serif"/>
+          <w:color w:val="000000"/>
+          <w:sz w:val="24"/>
+          <w:szCs w:val="24"/>
+          <w:shd w:fill="auto" w:val="clear"/>
+        </w:rPr>
+        <w:t xml:space="preserve">                                                                </w:t>
+      </w:r>
+    </w:p>
+    <w:p>
+      <w:pPr>
+        <w:pStyle w:val="Normal"/>
+        <w:spacing w:lineRule="atLeast" w:line="228"/>
+        <w:rPr>
+          <w:rFonts w:ascii="Liberation Serif" w:hAnsi="Liberation Serif"/>
+          <w:color w:val="000000"/>
+          <w:sz w:val="24"/>
+          <w:szCs w:val="24"/>
+          <w:highlight w:val="none"/>
+          <w:shd w:fill="auto" w:val="clear"/>
+        </w:rPr>
+      </w:pPr>
+      <w:r>
+        <w:rPr>
+          <w:rFonts w:ascii="Liberation Serif" w:hAnsi="Liberation Serif"/>
+          <w:color w:val="000000"/>
+          <w:sz w:val="24"/>
+          <w:szCs w:val="24"/>
+          <w:shd w:fill="auto" w:val="clear"/>
+        </w:rPr>
+        <w:t>----------------------------------------------------------------</w:t>
+      </w:r>
+    </w:p>
+    <w:p>
+      <w:pPr>
+        <w:pStyle w:val="Normal"/>
+        <w:spacing w:lineRule="atLeast" w:line="228"/>
+        <w:rPr>
+          <w:rFonts w:ascii="Liberation Serif" w:hAnsi="Liberation Serif"/>
+          <w:color w:val="000000"/>
+          <w:sz w:val="24"/>
+          <w:szCs w:val="24"/>
+          <w:highlight w:val="none"/>
+          <w:shd w:fill="auto" w:val="clear"/>
+        </w:rPr>
+      </w:pPr>
+      <w:r>
+        <w:rPr>
+          <w:rFonts w:ascii="Liberation Serif" w:hAnsi="Liberation Serif"/>
+          <w:color w:val="000000"/>
+          <w:sz w:val="24"/>
+          <w:szCs w:val="24"/>
+          <w:shd w:fill="auto" w:val="clear"/>
+        </w:rPr>
+        <w:t xml:space="preserve">     </w:t>
+      </w:r>
+      <w:r>
+        <w:rPr>
+          <w:rFonts w:ascii="Liberation Serif" w:hAnsi="Liberation Serif"/>
+          <w:color w:val="000000"/>
+          <w:sz w:val="24"/>
+          <w:szCs w:val="24"/>
+          <w:shd w:fill="auto" w:val="clear"/>
+        </w:rPr>
+        <w:t>surr_area_pct_hisp   Value  Num DF   Den DF  F Value Pr &gt; F</w:t>
+      </w:r>
+    </w:p>
+    <w:p>
+      <w:pPr>
+        <w:pStyle w:val="Normal"/>
+        <w:spacing w:lineRule="atLeast" w:line="228"/>
+        <w:rPr>
+          <w:rFonts w:ascii="Liberation Serif" w:hAnsi="Liberation Serif"/>
+          <w:color w:val="000000"/>
+          <w:sz w:val="24"/>
+          <w:szCs w:val="24"/>
+          <w:highlight w:val="none"/>
+          <w:shd w:fill="auto" w:val="clear"/>
+        </w:rPr>
+      </w:pPr>
+      <w:r>
+        <w:rPr>
+          <w:rFonts w:ascii="Liberation Serif" w:hAnsi="Liberation Serif"/>
+          <w:color w:val="000000"/>
+          <w:sz w:val="24"/>
+          <w:szCs w:val="24"/>
+          <w:shd w:fill="auto" w:val="clear"/>
+        </w:rPr>
+        <w:t>----------------------------------------------------------------</w:t>
+      </w:r>
+    </w:p>
+    <w:p>
+      <w:pPr>
+        <w:pStyle w:val="Normal"/>
+        <w:spacing w:lineRule="atLeast" w:line="228"/>
+        <w:rPr>
+          <w:rFonts w:ascii="Liberation Serif" w:hAnsi="Liberation Serif"/>
+          <w:color w:val="000000"/>
+          <w:sz w:val="24"/>
+          <w:szCs w:val="24"/>
+          <w:highlight w:val="none"/>
+          <w:shd w:fill="auto" w:val="clear"/>
+        </w:rPr>
+      </w:pPr>
+      <w:r>
+        <w:rPr>
+          <w:rFonts w:ascii="Liberation Serif" w:hAnsi="Liberation Serif"/>
+          <w:color w:val="000000"/>
+          <w:sz w:val="24"/>
+          <w:szCs w:val="24"/>
+          <w:shd w:fill="auto" w:val="clear"/>
+        </w:rPr>
+        <w:t xml:space="preserve">            </w:t>
+      </w:r>
+      <w:r>
+        <w:rPr>
+          <w:rFonts w:ascii="Liberation Serif" w:hAnsi="Liberation Serif"/>
+          <w:color w:val="000000"/>
+          <w:sz w:val="24"/>
+          <w:szCs w:val="24"/>
+          <w:shd w:fill="auto" w:val="clear"/>
+        </w:rPr>
+        <w:t>Wilks' lambda 0.9806 5.0000 2063.0000  8.1761 0.0000</w:t>
+      </w:r>
+    </w:p>
+    <w:p>
+      <w:pPr>
+        <w:pStyle w:val="Normal"/>
+        <w:spacing w:lineRule="atLeast" w:line="228"/>
+        <w:rPr>
+          <w:rFonts w:ascii="Liberation Serif" w:hAnsi="Liberation Serif"/>
+          <w:color w:val="000000"/>
+          <w:sz w:val="24"/>
+          <w:szCs w:val="24"/>
+          <w:highlight w:val="none"/>
+          <w:shd w:fill="auto" w:val="clear"/>
+        </w:rPr>
+      </w:pPr>
+      <w:r>
+        <w:rPr>
+          <w:rFonts w:ascii="Liberation Serif" w:hAnsi="Liberation Serif"/>
+          <w:color w:val="000000"/>
+          <w:sz w:val="24"/>
+          <w:szCs w:val="24"/>
+          <w:shd w:fill="auto" w:val="clear"/>
+        </w:rPr>
+        <w:t xml:space="preserve">           </w:t>
+      </w:r>
+      <w:r>
+        <w:rPr>
+          <w:rFonts w:ascii="Liberation Serif" w:hAnsi="Liberation Serif"/>
+          <w:color w:val="000000"/>
+          <w:sz w:val="24"/>
+          <w:szCs w:val="24"/>
+          <w:shd w:fill="auto" w:val="clear"/>
+        </w:rPr>
+        <w:t>Pillai's trace 0.0194 5.0000 2063.0000  8.1761 0.0000</w:t>
+      </w:r>
+    </w:p>
+    <w:p>
+      <w:pPr>
+        <w:pStyle w:val="Normal"/>
+        <w:spacing w:lineRule="atLeast" w:line="228"/>
+        <w:rPr>
+          <w:rFonts w:ascii="Liberation Serif" w:hAnsi="Liberation Serif"/>
+          <w:color w:val="000000"/>
+          <w:sz w:val="24"/>
+          <w:szCs w:val="24"/>
+          <w:highlight w:val="none"/>
+          <w:shd w:fill="auto" w:val="clear"/>
+        </w:rPr>
+      </w:pPr>
+      <w:r>
+        <w:rPr>
+          <w:rFonts w:ascii="Liberation Serif" w:hAnsi="Liberation Serif"/>
+          <w:color w:val="000000"/>
+          <w:sz w:val="24"/>
+          <w:szCs w:val="24"/>
+          <w:shd w:fill="auto" w:val="clear"/>
+        </w:rPr>
+        <w:t xml:space="preserve">   </w:t>
+      </w:r>
+      <w:r>
+        <w:rPr>
+          <w:rFonts w:ascii="Liberation Serif" w:hAnsi="Liberation Serif"/>
+          <w:color w:val="000000"/>
+          <w:sz w:val="24"/>
+          <w:szCs w:val="24"/>
+          <w:shd w:fill="auto" w:val="clear"/>
+        </w:rPr>
+        <w:t>Hotelling-Lawley trace 0.0198 5.0000 2063.0000  8.1761 0.0000</w:t>
+      </w:r>
+    </w:p>
+    <w:p>
+      <w:pPr>
+        <w:pStyle w:val="Normal"/>
+        <w:spacing w:lineRule="atLeast" w:line="228"/>
+        <w:rPr>
+          <w:rFonts w:ascii="Liberation Serif" w:hAnsi="Liberation Serif"/>
+          <w:color w:val="000000"/>
+          <w:sz w:val="24"/>
+          <w:szCs w:val="24"/>
+          <w:highlight w:val="none"/>
+          <w:shd w:fill="auto" w:val="clear"/>
+        </w:rPr>
+      </w:pPr>
+      <w:r>
+        <w:rPr>
+          <w:rFonts w:ascii="Liberation Serif" w:hAnsi="Liberation Serif"/>
+          <w:color w:val="000000"/>
+          <w:sz w:val="24"/>
+          <w:szCs w:val="24"/>
+          <w:shd w:fill="auto" w:val="clear"/>
+        </w:rPr>
+        <w:t xml:space="preserve">      </w:t>
+      </w:r>
+      <w:r>
+        <w:rPr>
+          <w:rFonts w:ascii="Liberation Serif" w:hAnsi="Liberation Serif"/>
+          <w:color w:val="000000"/>
+          <w:sz w:val="24"/>
+          <w:szCs w:val="24"/>
+          <w:shd w:fill="auto" w:val="clear"/>
+        </w:rPr>
+        <w:t>Roy's greatest root 0.0198 5.0000 2063.0000  8.1761 0.0000</w:t>
+      </w:r>
+    </w:p>
+    <w:p>
+      <w:pPr>
+        <w:pStyle w:val="Normal"/>
+        <w:spacing w:lineRule="atLeast" w:line="228"/>
+        <w:rPr>
+          <w:rFonts w:ascii="Liberation Serif" w:hAnsi="Liberation Serif"/>
+          <w:color w:val="000000"/>
+          <w:sz w:val="24"/>
+          <w:szCs w:val="24"/>
+          <w:highlight w:val="none"/>
+          <w:shd w:fill="auto" w:val="clear"/>
+        </w:rPr>
+      </w:pPr>
+      <w:r>
+        <w:rPr>
+          <w:rFonts w:ascii="Liberation Serif" w:hAnsi="Liberation Serif"/>
+          <w:color w:val="000000"/>
+          <w:sz w:val="24"/>
+          <w:szCs w:val="24"/>
+          <w:shd w:fill="auto" w:val="clear"/>
+        </w:rPr>
+        <w:t>----------------------------------------------------------------</w:t>
+      </w:r>
+    </w:p>
+    <w:p>
+      <w:pPr>
+        <w:pStyle w:val="Normal"/>
+        <w:spacing w:lineRule="atLeast" w:line="228"/>
+        <w:rPr>
+          <w:rFonts w:ascii="Liberation Serif" w:hAnsi="Liberation Serif"/>
+          <w:color w:val="000000"/>
+          <w:sz w:val="24"/>
+          <w:szCs w:val="24"/>
+          <w:highlight w:val="none"/>
+          <w:shd w:fill="auto" w:val="clear"/>
+        </w:rPr>
+      </w:pPr>
+      <w:r>
+        <w:rPr>
+          <w:rFonts w:ascii="Liberation Serif" w:hAnsi="Liberation Serif"/>
+          <w:color w:val="000000"/>
+          <w:sz w:val="24"/>
+          <w:szCs w:val="24"/>
+          <w:shd w:fill="auto" w:val="clear"/>
+        </w:rPr>
+        <w:t xml:space="preserve">                                                                </w:t>
+      </w:r>
+    </w:p>
+    <w:p>
+      <w:pPr>
+        <w:pStyle w:val="Normal"/>
+        <w:spacing w:lineRule="atLeast" w:line="228"/>
+        <w:rPr>
+          <w:rFonts w:ascii="Liberation Serif" w:hAnsi="Liberation Serif"/>
+          <w:color w:val="000000"/>
+          <w:sz w:val="24"/>
+          <w:szCs w:val="24"/>
+          <w:highlight w:val="none"/>
+          <w:shd w:fill="auto" w:val="clear"/>
+        </w:rPr>
+      </w:pPr>
+      <w:r>
+        <w:rPr>
+          <w:rFonts w:ascii="Liberation Serif" w:hAnsi="Liberation Serif"/>
+          <w:color w:val="000000"/>
+          <w:sz w:val="24"/>
+          <w:szCs w:val="24"/>
+          <w:shd w:fill="auto" w:val="clear"/>
+        </w:rPr>
+        <w:t>----------------------------------------------------------------</w:t>
+      </w:r>
+    </w:p>
+    <w:p>
+      <w:pPr>
+        <w:pStyle w:val="Normal"/>
+        <w:spacing w:lineRule="atLeast" w:line="228"/>
+        <w:rPr>
+          <w:rFonts w:ascii="Liberation Serif" w:hAnsi="Liberation Serif"/>
+          <w:color w:val="000000"/>
+          <w:sz w:val="24"/>
+          <w:szCs w:val="24"/>
+          <w:highlight w:val="none"/>
+          <w:shd w:fill="auto" w:val="clear"/>
+        </w:rPr>
+      </w:pPr>
+      <w:r>
+        <w:rPr>
+          <w:rFonts w:ascii="Liberation Serif" w:hAnsi="Liberation Serif"/>
+          <w:color w:val="000000"/>
+          <w:sz w:val="24"/>
+          <w:szCs w:val="24"/>
+          <w:shd w:fill="auto" w:val="clear"/>
+        </w:rPr>
+        <w:t xml:space="preserve">    </w:t>
+      </w:r>
+      <w:r>
+        <w:rPr>
+          <w:rFonts w:ascii="Liberation Serif" w:hAnsi="Liberation Serif"/>
+          <w:color w:val="000000"/>
+          <w:sz w:val="24"/>
+          <w:szCs w:val="24"/>
+          <w:shd w:fill="auto" w:val="clear"/>
+        </w:rPr>
+        <w:t>surr_area_pct_asian   Value  Num DF   Den DF  F Value Pr &gt; F</w:t>
+      </w:r>
+    </w:p>
+    <w:p>
+      <w:pPr>
+        <w:pStyle w:val="Normal"/>
+        <w:spacing w:lineRule="atLeast" w:line="228"/>
+        <w:rPr>
+          <w:rFonts w:ascii="Liberation Serif" w:hAnsi="Liberation Serif"/>
+          <w:color w:val="000000"/>
+          <w:sz w:val="24"/>
+          <w:szCs w:val="24"/>
+          <w:highlight w:val="none"/>
+          <w:shd w:fill="auto" w:val="clear"/>
+        </w:rPr>
+      </w:pPr>
+      <w:r>
+        <w:rPr>
+          <w:rFonts w:ascii="Liberation Serif" w:hAnsi="Liberation Serif"/>
+          <w:color w:val="000000"/>
+          <w:sz w:val="24"/>
+          <w:szCs w:val="24"/>
+          <w:shd w:fill="auto" w:val="clear"/>
+        </w:rPr>
+        <w:t>----------------------------------------------------------------</w:t>
+      </w:r>
+    </w:p>
+    <w:p>
+      <w:pPr>
+        <w:pStyle w:val="Normal"/>
+        <w:spacing w:lineRule="atLeast" w:line="228"/>
+        <w:rPr>
+          <w:rFonts w:ascii="Liberation Serif" w:hAnsi="Liberation Serif"/>
+          <w:color w:val="000000"/>
+          <w:sz w:val="24"/>
+          <w:szCs w:val="24"/>
+          <w:highlight w:val="none"/>
+          <w:shd w:fill="auto" w:val="clear"/>
+        </w:rPr>
+      </w:pPr>
+      <w:r>
+        <w:rPr>
+          <w:rFonts w:ascii="Liberation Serif" w:hAnsi="Liberation Serif"/>
+          <w:color w:val="000000"/>
+          <w:sz w:val="24"/>
+          <w:szCs w:val="24"/>
+          <w:shd w:fill="auto" w:val="clear"/>
+        </w:rPr>
+        <w:t xml:space="preserve">            </w:t>
+      </w:r>
+      <w:r>
+        <w:rPr>
+          <w:rFonts w:ascii="Liberation Serif" w:hAnsi="Liberation Serif"/>
+          <w:color w:val="000000"/>
+          <w:sz w:val="24"/>
+          <w:szCs w:val="24"/>
+          <w:shd w:fill="auto" w:val="clear"/>
+        </w:rPr>
+        <w:t>Wilks' lambda 0.9808 5.0000 2063.0000  8.0693 0.0000</w:t>
+      </w:r>
+    </w:p>
+    <w:p>
+      <w:pPr>
+        <w:pStyle w:val="Normal"/>
+        <w:spacing w:lineRule="atLeast" w:line="228"/>
+        <w:rPr>
+          <w:rFonts w:ascii="Liberation Serif" w:hAnsi="Liberation Serif"/>
+          <w:color w:val="000000"/>
+          <w:sz w:val="24"/>
+          <w:szCs w:val="24"/>
+          <w:highlight w:val="none"/>
+          <w:shd w:fill="auto" w:val="clear"/>
+        </w:rPr>
+      </w:pPr>
+      <w:r>
+        <w:rPr>
+          <w:rFonts w:ascii="Liberation Serif" w:hAnsi="Liberation Serif"/>
+          <w:color w:val="000000"/>
+          <w:sz w:val="24"/>
+          <w:szCs w:val="24"/>
+          <w:shd w:fill="auto" w:val="clear"/>
+        </w:rPr>
+        <w:t xml:space="preserve">           </w:t>
+      </w:r>
+      <w:r>
+        <w:rPr>
+          <w:rFonts w:ascii="Liberation Serif" w:hAnsi="Liberation Serif"/>
+          <w:color w:val="000000"/>
+          <w:sz w:val="24"/>
+          <w:szCs w:val="24"/>
+          <w:shd w:fill="auto" w:val="clear"/>
+        </w:rPr>
+        <w:t>Pillai's trace 0.0192 5.0000 2063.0000  8.0693 0.0000</w:t>
+      </w:r>
+    </w:p>
+    <w:p>
+      <w:pPr>
+        <w:pStyle w:val="Normal"/>
+        <w:spacing w:lineRule="atLeast" w:line="228"/>
+        <w:rPr>
+          <w:rFonts w:ascii="Liberation Serif" w:hAnsi="Liberation Serif"/>
+          <w:color w:val="000000"/>
+          <w:sz w:val="24"/>
+          <w:szCs w:val="24"/>
+          <w:highlight w:val="none"/>
+          <w:shd w:fill="auto" w:val="clear"/>
+        </w:rPr>
+      </w:pPr>
+      <w:r>
+        <w:rPr>
+          <w:rFonts w:ascii="Liberation Serif" w:hAnsi="Liberation Serif"/>
+          <w:color w:val="000000"/>
+          <w:sz w:val="24"/>
+          <w:szCs w:val="24"/>
+          <w:shd w:fill="auto" w:val="clear"/>
+        </w:rPr>
+        <w:t xml:space="preserve">   </w:t>
+      </w:r>
+      <w:r>
+        <w:rPr>
+          <w:rFonts w:ascii="Liberation Serif" w:hAnsi="Liberation Serif"/>
+          <w:color w:val="000000"/>
+          <w:sz w:val="24"/>
+          <w:szCs w:val="24"/>
+          <w:shd w:fill="auto" w:val="clear"/>
+        </w:rPr>
+        <w:t>Hotelling-Lawley trace 0.0196 5.0000 2063.0000  8.0693 0.0000</w:t>
+      </w:r>
+    </w:p>
+    <w:p>
+      <w:pPr>
+        <w:pStyle w:val="Normal"/>
+        <w:spacing w:lineRule="atLeast" w:line="228"/>
+        <w:rPr>
+          <w:rFonts w:ascii="Liberation Serif" w:hAnsi="Liberation Serif"/>
+          <w:color w:val="000000"/>
+          <w:sz w:val="24"/>
+          <w:szCs w:val="24"/>
+          <w:highlight w:val="none"/>
+          <w:shd w:fill="auto" w:val="clear"/>
+        </w:rPr>
+      </w:pPr>
+      <w:r>
+        <w:rPr>
+          <w:rFonts w:ascii="Liberation Serif" w:hAnsi="Liberation Serif"/>
+          <w:color w:val="000000"/>
+          <w:sz w:val="24"/>
+          <w:szCs w:val="24"/>
+          <w:shd w:fill="auto" w:val="clear"/>
+        </w:rPr>
+        <w:t xml:space="preserve">      </w:t>
+      </w:r>
+      <w:r>
+        <w:rPr>
+          <w:rFonts w:ascii="Liberation Serif" w:hAnsi="Liberation Serif"/>
+          <w:color w:val="000000"/>
+          <w:sz w:val="24"/>
+          <w:szCs w:val="24"/>
+          <w:shd w:fill="auto" w:val="clear"/>
+        </w:rPr>
+        <w:t>Roy's greatest root 0.0196 5.0000 2063.0000  8.0693 0.0000</w:t>
+      </w:r>
+    </w:p>
+    <w:p>
+      <w:pPr>
+        <w:pStyle w:val="Normal"/>
+        <w:spacing w:lineRule="atLeast" w:line="228"/>
+        <w:rPr>
+          <w:rFonts w:ascii="Liberation Serif" w:hAnsi="Liberation Serif"/>
+          <w:color w:val="000000"/>
+          <w:sz w:val="24"/>
+          <w:szCs w:val="24"/>
+          <w:highlight w:val="none"/>
+          <w:shd w:fill="auto" w:val="clear"/>
+        </w:rPr>
+      </w:pPr>
+      <w:r>
+        <w:rPr>
+          <w:rFonts w:ascii="Liberation Serif" w:hAnsi="Liberation Serif"/>
+          <w:color w:val="000000"/>
+          <w:sz w:val="24"/>
+          <w:szCs w:val="24"/>
+          <w:shd w:fill="auto" w:val="clear"/>
+        </w:rPr>
+        <w:t>----------------------------------------------------------------</w:t>
+      </w:r>
+    </w:p>
+    <w:p>
+      <w:pPr>
+        <w:pStyle w:val="Normal"/>
+        <w:spacing w:lineRule="atLeast" w:line="228"/>
+        <w:rPr>
+          <w:rFonts w:ascii="Liberation Serif" w:hAnsi="Liberation Serif"/>
+          <w:color w:val="000000"/>
+          <w:sz w:val="24"/>
+          <w:szCs w:val="24"/>
+          <w:highlight w:val="none"/>
+          <w:shd w:fill="auto" w:val="clear"/>
+        </w:rPr>
+      </w:pPr>
+      <w:r>
+        <w:rPr>
+          <w:rFonts w:ascii="Liberation Serif" w:hAnsi="Liberation Serif"/>
+          <w:color w:val="000000"/>
+          <w:sz w:val="24"/>
+          <w:szCs w:val="24"/>
+          <w:shd w:fill="auto" w:val="clear"/>
+        </w:rPr>
+        <w:t xml:space="preserve">                                                                </w:t>
+      </w:r>
+    </w:p>
+    <w:p>
+      <w:pPr>
+        <w:pStyle w:val="Normal"/>
+        <w:spacing w:lineRule="atLeast" w:line="228"/>
+        <w:rPr>
+          <w:rFonts w:ascii="Liberation Serif" w:hAnsi="Liberation Serif"/>
+          <w:color w:val="000000"/>
+          <w:sz w:val="24"/>
+          <w:szCs w:val="24"/>
+          <w:highlight w:val="none"/>
+          <w:shd w:fill="auto" w:val="clear"/>
+        </w:rPr>
+      </w:pPr>
+      <w:r>
+        <w:rPr>
+          <w:rFonts w:ascii="Liberation Serif" w:hAnsi="Liberation Serif"/>
+          <w:color w:val="000000"/>
+          <w:sz w:val="24"/>
+          <w:szCs w:val="24"/>
+          <w:shd w:fill="auto" w:val="clear"/>
+        </w:rPr>
+        <w:t>----------------------------------------------------------------</w:t>
+      </w:r>
+    </w:p>
+    <w:p>
+      <w:pPr>
+        <w:pStyle w:val="Normal"/>
+        <w:spacing w:lineRule="atLeast" w:line="228"/>
+        <w:rPr>
+          <w:rFonts w:ascii="Liberation Serif" w:hAnsi="Liberation Serif"/>
+          <w:color w:val="000000"/>
+          <w:sz w:val="24"/>
+          <w:szCs w:val="24"/>
+          <w:highlight w:val="none"/>
+          <w:shd w:fill="auto" w:val="clear"/>
+        </w:rPr>
+      </w:pPr>
+      <w:r>
+        <w:rPr>
+          <w:rFonts w:ascii="Liberation Serif" w:hAnsi="Liberation Serif"/>
+          <w:color w:val="000000"/>
+          <w:sz w:val="24"/>
+          <w:szCs w:val="24"/>
+          <w:shd w:fill="auto" w:val="clear"/>
+        </w:rPr>
+        <w:t xml:space="preserve">    </w:t>
+      </w:r>
+      <w:r>
+        <w:rPr>
+          <w:rFonts w:ascii="Liberation Serif" w:hAnsi="Liberation Serif"/>
+          <w:color w:val="000000"/>
+          <w:sz w:val="24"/>
+          <w:szCs w:val="24"/>
+          <w:shd w:fill="auto" w:val="clear"/>
+        </w:rPr>
+        <w:t>surr_area_pct_other   Value  Num DF   Den DF  F Value Pr &gt; F</w:t>
+      </w:r>
+    </w:p>
+    <w:p>
+      <w:pPr>
+        <w:pStyle w:val="Normal"/>
+        <w:spacing w:lineRule="atLeast" w:line="228"/>
+        <w:rPr>
+          <w:rFonts w:ascii="Liberation Serif" w:hAnsi="Liberation Serif"/>
+          <w:color w:val="000000"/>
+          <w:sz w:val="24"/>
+          <w:szCs w:val="24"/>
+          <w:highlight w:val="none"/>
+          <w:shd w:fill="auto" w:val="clear"/>
+        </w:rPr>
+      </w:pPr>
+      <w:r>
+        <w:rPr>
+          <w:rFonts w:ascii="Liberation Serif" w:hAnsi="Liberation Serif"/>
+          <w:color w:val="000000"/>
+          <w:sz w:val="24"/>
+          <w:szCs w:val="24"/>
+          <w:shd w:fill="auto" w:val="clear"/>
+        </w:rPr>
+        <w:t>----------------------------------------------------------------</w:t>
+      </w:r>
+    </w:p>
+    <w:p>
+      <w:pPr>
+        <w:pStyle w:val="Normal"/>
+        <w:spacing w:lineRule="atLeast" w:line="228"/>
+        <w:rPr>
+          <w:rFonts w:ascii="Liberation Serif" w:hAnsi="Liberation Serif"/>
+          <w:color w:val="000000"/>
+          <w:sz w:val="24"/>
+          <w:szCs w:val="24"/>
+          <w:highlight w:val="none"/>
+          <w:shd w:fill="auto" w:val="clear"/>
+        </w:rPr>
+      </w:pPr>
+      <w:r>
+        <w:rPr>
+          <w:rFonts w:ascii="Liberation Serif" w:hAnsi="Liberation Serif"/>
+          <w:color w:val="000000"/>
+          <w:sz w:val="24"/>
+          <w:szCs w:val="24"/>
+          <w:shd w:fill="auto" w:val="clear"/>
+        </w:rPr>
+        <w:t xml:space="preserve">            </w:t>
+      </w:r>
+      <w:r>
+        <w:rPr>
+          <w:rFonts w:ascii="Liberation Serif" w:hAnsi="Liberation Serif"/>
+          <w:color w:val="000000"/>
+          <w:sz w:val="24"/>
+          <w:szCs w:val="24"/>
+          <w:shd w:fill="auto" w:val="clear"/>
+        </w:rPr>
+        <w:t>Wilks' lambda 0.9813 5.0000 2063.0000  7.8838 0.0000</w:t>
+      </w:r>
+    </w:p>
+    <w:p>
+      <w:pPr>
+        <w:pStyle w:val="Normal"/>
+        <w:spacing w:lineRule="atLeast" w:line="228"/>
+        <w:rPr>
+          <w:rFonts w:ascii="Liberation Serif" w:hAnsi="Liberation Serif"/>
+          <w:color w:val="000000"/>
+          <w:sz w:val="24"/>
+          <w:szCs w:val="24"/>
+          <w:highlight w:val="none"/>
+          <w:shd w:fill="auto" w:val="clear"/>
+        </w:rPr>
+      </w:pPr>
+      <w:r>
+        <w:rPr>
+          <w:rFonts w:ascii="Liberation Serif" w:hAnsi="Liberation Serif"/>
+          <w:color w:val="000000"/>
+          <w:sz w:val="24"/>
+          <w:szCs w:val="24"/>
+          <w:shd w:fill="auto" w:val="clear"/>
+        </w:rPr>
+        <w:t xml:space="preserve">           </w:t>
+      </w:r>
+      <w:r>
+        <w:rPr>
+          <w:rFonts w:ascii="Liberation Serif" w:hAnsi="Liberation Serif"/>
+          <w:color w:val="000000"/>
+          <w:sz w:val="24"/>
+          <w:szCs w:val="24"/>
+          <w:shd w:fill="auto" w:val="clear"/>
+        </w:rPr>
+        <w:t>Pillai's trace 0.0187 5.0000 2063.0000  7.8838 0.0000</w:t>
+      </w:r>
+    </w:p>
+    <w:p>
+      <w:pPr>
+        <w:pStyle w:val="Normal"/>
+        <w:spacing w:lineRule="atLeast" w:line="228"/>
+        <w:rPr>
+          <w:rFonts w:ascii="Liberation Serif" w:hAnsi="Liberation Serif"/>
+          <w:color w:val="000000"/>
+          <w:sz w:val="24"/>
+          <w:szCs w:val="24"/>
+          <w:highlight w:val="none"/>
+          <w:shd w:fill="auto" w:val="clear"/>
+        </w:rPr>
+      </w:pPr>
+      <w:r>
+        <w:rPr>
+          <w:rFonts w:ascii="Liberation Serif" w:hAnsi="Liberation Serif"/>
+          <w:color w:val="000000"/>
+          <w:sz w:val="24"/>
+          <w:szCs w:val="24"/>
+          <w:shd w:fill="auto" w:val="clear"/>
+        </w:rPr>
+        <w:t xml:space="preserve">   </w:t>
+      </w:r>
+      <w:r>
+        <w:rPr>
+          <w:rFonts w:ascii="Liberation Serif" w:hAnsi="Liberation Serif"/>
+          <w:color w:val="000000"/>
+          <w:sz w:val="24"/>
+          <w:szCs w:val="24"/>
+          <w:shd w:fill="auto" w:val="clear"/>
+        </w:rPr>
+        <w:t>Hotelling-Lawley trace 0.0191 5.0000 2063.0000  7.8838 0.0000</w:t>
+      </w:r>
+    </w:p>
+    <w:p>
+      <w:pPr>
+        <w:pStyle w:val="Normal"/>
+        <w:spacing w:lineRule="atLeast" w:line="228"/>
+        <w:rPr>
+          <w:rFonts w:ascii="Liberation Serif" w:hAnsi="Liberation Serif"/>
+          <w:color w:val="000000"/>
+          <w:sz w:val="24"/>
+          <w:szCs w:val="24"/>
+          <w:highlight w:val="none"/>
+          <w:shd w:fill="auto" w:val="clear"/>
+        </w:rPr>
+      </w:pPr>
+      <w:r>
+        <w:rPr>
+          <w:rFonts w:ascii="Liberation Serif" w:hAnsi="Liberation Serif"/>
+          <w:color w:val="000000"/>
+          <w:sz w:val="24"/>
+          <w:szCs w:val="24"/>
+          <w:shd w:fill="auto" w:val="clear"/>
+        </w:rPr>
+        <w:t xml:space="preserve">      </w:t>
+      </w:r>
+      <w:r>
+        <w:rPr>
+          <w:rFonts w:ascii="Liberation Serif" w:hAnsi="Liberation Serif"/>
+          <w:color w:val="000000"/>
+          <w:sz w:val="24"/>
+          <w:szCs w:val="24"/>
+          <w:shd w:fill="auto" w:val="clear"/>
+        </w:rPr>
+        <w:t>Roy's greatest root 0.0191 5.0000 2063.0000  7.8838 0.0000</w:t>
+      </w:r>
+    </w:p>
+    <w:p>
+      <w:pPr>
+        <w:pStyle w:val="Normal"/>
+        <w:spacing w:lineRule="atLeast" w:line="228"/>
+        <w:rPr>
+          <w:rFonts w:ascii="Liberation Serif" w:hAnsi="Liberation Serif"/>
+          <w:color w:val="000000"/>
+          <w:sz w:val="24"/>
+          <w:szCs w:val="24"/>
+          <w:highlight w:val="none"/>
+          <w:shd w:fill="auto" w:val="clear"/>
+        </w:rPr>
+      </w:pPr>
+      <w:r>
+        <w:rPr>
+          <w:rFonts w:ascii="Liberation Serif" w:hAnsi="Liberation Serif"/>
+          <w:color w:val="000000"/>
+          <w:sz w:val="24"/>
+          <w:szCs w:val="24"/>
+          <w:shd w:fill="auto" w:val="clear"/>
+        </w:rPr>
+        <w:t>----------------------------------------------------------------</w:t>
+      </w:r>
+    </w:p>
+    <w:p>
+      <w:pPr>
+        <w:pStyle w:val="Normal"/>
+        <w:spacing w:lineRule="atLeast" w:line="228"/>
+        <w:rPr>
+          <w:rFonts w:ascii="Liberation Serif" w:hAnsi="Liberation Serif"/>
+          <w:color w:val="000000"/>
+          <w:sz w:val="24"/>
+          <w:szCs w:val="24"/>
+          <w:highlight w:val="none"/>
+          <w:shd w:fill="auto" w:val="clear"/>
+        </w:rPr>
+      </w:pPr>
+      <w:r>
+        <w:rPr>
+          <w:rFonts w:ascii="Liberation Serif" w:hAnsi="Liberation Serif"/>
+          <w:color w:val="000000"/>
+          <w:sz w:val="24"/>
+          <w:szCs w:val="24"/>
+          <w:shd w:fill="auto" w:val="clear"/>
+        </w:rPr>
+        <w:t xml:space="preserve">                                                                </w:t>
+      </w:r>
+    </w:p>
+    <w:p>
+      <w:pPr>
+        <w:pStyle w:val="Normal"/>
+        <w:spacing w:lineRule="atLeast" w:line="228"/>
+        <w:rPr>
+          <w:rFonts w:ascii="Liberation Serif" w:hAnsi="Liberation Serif"/>
+          <w:color w:val="000000"/>
+          <w:sz w:val="24"/>
+          <w:szCs w:val="24"/>
+          <w:highlight w:val="none"/>
+          <w:shd w:fill="auto" w:val="clear"/>
+        </w:rPr>
+      </w:pPr>
+      <w:r>
+        <w:rPr>
+          <w:rFonts w:ascii="Liberation Serif" w:hAnsi="Liberation Serif"/>
+          <w:color w:val="000000"/>
+          <w:sz w:val="24"/>
+          <w:szCs w:val="24"/>
+          <w:shd w:fill="auto" w:val="clear"/>
+        </w:rPr>
+        <w:t>----------------------------------------------------------------</w:t>
+      </w:r>
+    </w:p>
+    <w:p>
+      <w:pPr>
+        <w:pStyle w:val="Normal"/>
+        <w:spacing w:lineRule="atLeast" w:line="228"/>
+        <w:rPr>
+          <w:rFonts w:ascii="Liberation Serif" w:hAnsi="Liberation Serif"/>
+          <w:color w:val="000000"/>
+          <w:sz w:val="24"/>
+          <w:szCs w:val="24"/>
+          <w:highlight w:val="none"/>
+          <w:shd w:fill="auto" w:val="clear"/>
+        </w:rPr>
+      </w:pPr>
+      <w:r>
+        <w:rPr>
+          <w:rFonts w:ascii="Liberation Serif" w:hAnsi="Liberation Serif"/>
+          <w:color w:val="000000"/>
+          <w:sz w:val="24"/>
+          <w:szCs w:val="24"/>
+          <w:shd w:fill="auto" w:val="clear"/>
+        </w:rPr>
+        <w:t xml:space="preserve">           </w:t>
+      </w:r>
+      <w:r>
+        <w:rPr>
+          <w:rFonts w:ascii="Liberation Serif" w:hAnsi="Liberation Serif"/>
+          <w:color w:val="000000"/>
+          <w:sz w:val="24"/>
+          <w:szCs w:val="24"/>
+          <w:shd w:fill="auto" w:val="clear"/>
+        </w:rPr>
+        <w:t>avg_G          Value  Num DF   Den DF  F Value Pr &gt; F</w:t>
+      </w:r>
+    </w:p>
+    <w:p>
+      <w:pPr>
+        <w:pStyle w:val="Normal"/>
+        <w:spacing w:lineRule="atLeast" w:line="228"/>
+        <w:rPr>
+          <w:rFonts w:ascii="Liberation Serif" w:hAnsi="Liberation Serif"/>
+          <w:color w:val="000000"/>
+          <w:sz w:val="24"/>
+          <w:szCs w:val="24"/>
+          <w:highlight w:val="none"/>
+          <w:shd w:fill="auto" w:val="clear"/>
+        </w:rPr>
+      </w:pPr>
+      <w:r>
+        <w:rPr>
+          <w:rFonts w:ascii="Liberation Serif" w:hAnsi="Liberation Serif"/>
+          <w:color w:val="000000"/>
+          <w:sz w:val="24"/>
+          <w:szCs w:val="24"/>
+          <w:shd w:fill="auto" w:val="clear"/>
+        </w:rPr>
+        <w:t>----------------------------------------------------------------</w:t>
+      </w:r>
+    </w:p>
+    <w:p>
+      <w:pPr>
+        <w:pStyle w:val="Normal"/>
+        <w:spacing w:lineRule="atLeast" w:line="228"/>
+        <w:rPr>
+          <w:rFonts w:ascii="Liberation Serif" w:hAnsi="Liberation Serif"/>
+          <w:color w:val="000000"/>
+          <w:sz w:val="24"/>
+          <w:szCs w:val="24"/>
+          <w:highlight w:val="none"/>
+          <w:shd w:fill="auto" w:val="clear"/>
+        </w:rPr>
+      </w:pPr>
+      <w:r>
+        <w:rPr>
+          <w:rFonts w:ascii="Liberation Serif" w:hAnsi="Liberation Serif"/>
+          <w:color w:val="000000"/>
+          <w:sz w:val="24"/>
+          <w:szCs w:val="24"/>
+          <w:shd w:fill="auto" w:val="clear"/>
+        </w:rPr>
+        <w:t xml:space="preserve">            </w:t>
+      </w:r>
+      <w:r>
+        <w:rPr>
+          <w:rFonts w:ascii="Liberation Serif" w:hAnsi="Liberation Serif"/>
+          <w:color w:val="000000"/>
+          <w:sz w:val="24"/>
+          <w:szCs w:val="24"/>
+          <w:shd w:fill="auto" w:val="clear"/>
+        </w:rPr>
+        <w:t>Wilks' lambda 0.9987 5.0000 2063.0000  0.5242 0.7581</w:t>
+      </w:r>
+    </w:p>
+    <w:p>
+      <w:pPr>
+        <w:pStyle w:val="Normal"/>
+        <w:spacing w:lineRule="atLeast" w:line="228"/>
+        <w:rPr>
+          <w:rFonts w:ascii="Liberation Serif" w:hAnsi="Liberation Serif"/>
+          <w:color w:val="000000"/>
+          <w:sz w:val="24"/>
+          <w:szCs w:val="24"/>
+          <w:highlight w:val="none"/>
+          <w:shd w:fill="auto" w:val="clear"/>
+        </w:rPr>
+      </w:pPr>
+      <w:r>
+        <w:rPr>
+          <w:rFonts w:ascii="Liberation Serif" w:hAnsi="Liberation Serif"/>
+          <w:color w:val="000000"/>
+          <w:sz w:val="24"/>
+          <w:szCs w:val="24"/>
+          <w:shd w:fill="auto" w:val="clear"/>
+        </w:rPr>
+        <w:t xml:space="preserve">           </w:t>
+      </w:r>
+      <w:r>
+        <w:rPr>
+          <w:rFonts w:ascii="Liberation Serif" w:hAnsi="Liberation Serif"/>
+          <w:color w:val="000000"/>
+          <w:sz w:val="24"/>
+          <w:szCs w:val="24"/>
+          <w:shd w:fill="auto" w:val="clear"/>
+        </w:rPr>
+        <w:t>Pillai's trace 0.0013 5.0000 2063.0000  0.5242 0.7581</w:t>
+      </w:r>
+    </w:p>
+    <w:p>
+      <w:pPr>
+        <w:pStyle w:val="Normal"/>
+        <w:spacing w:lineRule="atLeast" w:line="228"/>
+        <w:rPr>
+          <w:rFonts w:ascii="Liberation Serif" w:hAnsi="Liberation Serif"/>
+          <w:color w:val="000000"/>
+          <w:sz w:val="24"/>
+          <w:szCs w:val="24"/>
+          <w:highlight w:val="none"/>
+          <w:shd w:fill="auto" w:val="clear"/>
+        </w:rPr>
+      </w:pPr>
+      <w:r>
+        <w:rPr>
+          <w:rFonts w:ascii="Liberation Serif" w:hAnsi="Liberation Serif"/>
+          <w:color w:val="000000"/>
+          <w:sz w:val="24"/>
+          <w:szCs w:val="24"/>
+          <w:shd w:fill="auto" w:val="clear"/>
+        </w:rPr>
+        <w:t xml:space="preserve">   </w:t>
+      </w:r>
+      <w:r>
+        <w:rPr>
+          <w:rFonts w:ascii="Liberation Serif" w:hAnsi="Liberation Serif"/>
+          <w:color w:val="000000"/>
+          <w:sz w:val="24"/>
+          <w:szCs w:val="24"/>
+          <w:shd w:fill="auto" w:val="clear"/>
+        </w:rPr>
+        <w:t>Hotelling-Lawley trace 0.0013 5.0000 2063.0000  0.5242 0.7581</w:t>
+      </w:r>
+    </w:p>
+    <w:p>
+      <w:pPr>
+        <w:pStyle w:val="Normal"/>
+        <w:spacing w:lineRule="atLeast" w:line="228"/>
+        <w:rPr>
+          <w:rFonts w:ascii="Liberation Serif" w:hAnsi="Liberation Serif"/>
+          <w:color w:val="000000"/>
+          <w:sz w:val="24"/>
+          <w:szCs w:val="24"/>
+          <w:highlight w:val="none"/>
+          <w:shd w:fill="auto" w:val="clear"/>
+        </w:rPr>
+      </w:pPr>
+      <w:r>
+        <w:rPr>
+          <w:rFonts w:ascii="Liberation Serif" w:hAnsi="Liberation Serif"/>
+          <w:color w:val="000000"/>
+          <w:sz w:val="24"/>
+          <w:szCs w:val="24"/>
+          <w:shd w:fill="auto" w:val="clear"/>
+        </w:rPr>
+        <w:t xml:space="preserve">      </w:t>
+      </w:r>
+      <w:r>
+        <w:rPr>
+          <w:rFonts w:ascii="Liberation Serif" w:hAnsi="Liberation Serif"/>
+          <w:color w:val="000000"/>
+          <w:sz w:val="24"/>
+          <w:szCs w:val="24"/>
+          <w:shd w:fill="auto" w:val="clear"/>
+        </w:rPr>
+        <w:t>Roy's greatest root 0.0013 5.0000 2063.0000  0.5242 0.7581</w:t>
+      </w:r>
+    </w:p>
+    <w:p>
+      <w:pPr>
+        <w:pStyle w:val="Normal"/>
+        <w:spacing w:lineRule="atLeast" w:line="228"/>
+        <w:rPr>
+          <w:rFonts w:ascii="Liberation Serif" w:hAnsi="Liberation Serif"/>
+          <w:color w:val="000000"/>
+          <w:sz w:val="24"/>
+          <w:szCs w:val="24"/>
+          <w:highlight w:val="none"/>
+          <w:shd w:fill="auto" w:val="clear"/>
+        </w:rPr>
+      </w:pPr>
+      <w:r>
+        <w:rPr>
+          <w:rFonts w:ascii="Liberation Serif" w:hAnsi="Liberation Serif"/>
+          <w:color w:val="000000"/>
+          <w:sz w:val="24"/>
+          <w:szCs w:val="24"/>
+          <w:shd w:fill="auto" w:val="clear"/>
+        </w:rPr>
+        <w:t>----------------------------------------------------------------</w:t>
+      </w:r>
+    </w:p>
+    <w:p>
+      <w:pPr>
+        <w:pStyle w:val="Normal"/>
+        <w:spacing w:lineRule="atLeast" w:line="228"/>
+        <w:rPr>
+          <w:rFonts w:ascii="Liberation Serif" w:hAnsi="Liberation Serif"/>
+          <w:color w:val="000000"/>
+          <w:sz w:val="24"/>
+          <w:szCs w:val="24"/>
+          <w:highlight w:val="none"/>
+          <w:shd w:fill="auto" w:val="clear"/>
+        </w:rPr>
+      </w:pPr>
+      <w:r>
+        <w:rPr>
+          <w:rFonts w:ascii="Liberation Serif" w:hAnsi="Liberation Serif"/>
+          <w:color w:val="000000"/>
+          <w:sz w:val="24"/>
+          <w:szCs w:val="24"/>
+          <w:shd w:fill="auto" w:val="clear"/>
+        </w:rPr>
+        <w:t xml:space="preserve">                                                                </w:t>
+      </w:r>
+    </w:p>
+    <w:p>
+      <w:pPr>
+        <w:pStyle w:val="Normal"/>
+        <w:spacing w:lineRule="atLeast" w:line="228"/>
+        <w:rPr>
+          <w:rFonts w:ascii="Liberation Serif" w:hAnsi="Liberation Serif"/>
+          <w:color w:val="000000"/>
+          <w:sz w:val="24"/>
+          <w:szCs w:val="24"/>
+          <w:highlight w:val="none"/>
+          <w:shd w:fill="auto" w:val="clear"/>
+        </w:rPr>
+      </w:pPr>
+      <w:r>
+        <w:rPr>
+          <w:rFonts w:ascii="Liberation Serif" w:hAnsi="Liberation Serif"/>
+          <w:color w:val="000000"/>
+          <w:sz w:val="24"/>
+          <w:szCs w:val="24"/>
+          <w:shd w:fill="auto" w:val="clear"/>
+        </w:rPr>
+        <w:t>----------------------------------------------------------------</w:t>
+      </w:r>
+    </w:p>
+    <w:p>
+      <w:pPr>
+        <w:pStyle w:val="Normal"/>
+        <w:spacing w:lineRule="atLeast" w:line="228"/>
+        <w:rPr>
+          <w:rFonts w:ascii="Liberation Serif" w:hAnsi="Liberation Serif"/>
+          <w:color w:val="000000"/>
+          <w:sz w:val="24"/>
+          <w:szCs w:val="24"/>
+          <w:highlight w:val="none"/>
+          <w:shd w:fill="auto" w:val="clear"/>
+        </w:rPr>
+      </w:pPr>
+      <w:r>
+        <w:rPr>
+          <w:rFonts w:ascii="Liberation Serif" w:hAnsi="Liberation Serif"/>
+          <w:color w:val="000000"/>
+          <w:sz w:val="24"/>
+          <w:szCs w:val="24"/>
+          <w:shd w:fill="auto" w:val="clear"/>
+        </w:rPr>
+        <w:t xml:space="preserve">          </w:t>
+      </w:r>
+      <w:r>
+        <w:rPr>
+          <w:rFonts w:ascii="Liberation Serif" w:hAnsi="Liberation Serif"/>
+          <w:color w:val="000000"/>
+          <w:sz w:val="24"/>
+          <w:szCs w:val="24"/>
+          <w:shd w:fill="auto" w:val="clear"/>
+        </w:rPr>
+        <w:t>median_G        Value  Num DF   Den DF  F Value Pr &gt; F</w:t>
+      </w:r>
+    </w:p>
+    <w:p>
+      <w:pPr>
+        <w:pStyle w:val="Normal"/>
+        <w:spacing w:lineRule="atLeast" w:line="228"/>
+        <w:rPr>
+          <w:rFonts w:ascii="Liberation Serif" w:hAnsi="Liberation Serif"/>
+          <w:color w:val="000000"/>
+          <w:sz w:val="24"/>
+          <w:szCs w:val="24"/>
+          <w:highlight w:val="none"/>
+          <w:shd w:fill="auto" w:val="clear"/>
+        </w:rPr>
+      </w:pPr>
+      <w:r>
+        <w:rPr>
+          <w:rFonts w:ascii="Liberation Serif" w:hAnsi="Liberation Serif"/>
+          <w:color w:val="000000"/>
+          <w:sz w:val="24"/>
+          <w:szCs w:val="24"/>
+          <w:shd w:fill="auto" w:val="clear"/>
+        </w:rPr>
+        <w:t>----------------------------------------------------------------</w:t>
+      </w:r>
+    </w:p>
+    <w:p>
+      <w:pPr>
+        <w:pStyle w:val="Normal"/>
+        <w:spacing w:lineRule="atLeast" w:line="228"/>
+        <w:rPr>
+          <w:rFonts w:ascii="Liberation Serif" w:hAnsi="Liberation Serif"/>
+          <w:color w:val="000000"/>
+          <w:sz w:val="24"/>
+          <w:szCs w:val="24"/>
+          <w:highlight w:val="none"/>
+          <w:shd w:fill="auto" w:val="clear"/>
+        </w:rPr>
+      </w:pPr>
+      <w:r>
+        <w:rPr>
+          <w:rFonts w:ascii="Liberation Serif" w:hAnsi="Liberation Serif"/>
+          <w:color w:val="000000"/>
+          <w:sz w:val="24"/>
+          <w:szCs w:val="24"/>
+          <w:shd w:fill="auto" w:val="clear"/>
+        </w:rPr>
+        <w:t xml:space="preserve">            </w:t>
+      </w:r>
+      <w:r>
+        <w:rPr>
+          <w:rFonts w:ascii="Liberation Serif" w:hAnsi="Liberation Serif"/>
+          <w:color w:val="000000"/>
+          <w:sz w:val="24"/>
+          <w:szCs w:val="24"/>
+          <w:shd w:fill="auto" w:val="clear"/>
+        </w:rPr>
+        <w:t>Wilks' lambda 0.9985 5.0000 2063.0000  0.5995 0.7004</w:t>
+      </w:r>
+    </w:p>
+    <w:p>
+      <w:pPr>
+        <w:pStyle w:val="Normal"/>
+        <w:spacing w:lineRule="atLeast" w:line="228"/>
+        <w:rPr>
+          <w:rFonts w:ascii="Liberation Serif" w:hAnsi="Liberation Serif"/>
+          <w:color w:val="000000"/>
+          <w:sz w:val="24"/>
+          <w:szCs w:val="24"/>
+          <w:highlight w:val="none"/>
+          <w:shd w:fill="auto" w:val="clear"/>
+        </w:rPr>
+      </w:pPr>
+      <w:r>
+        <w:rPr>
+          <w:rFonts w:ascii="Liberation Serif" w:hAnsi="Liberation Serif"/>
+          <w:color w:val="000000"/>
+          <w:sz w:val="24"/>
+          <w:szCs w:val="24"/>
+          <w:shd w:fill="auto" w:val="clear"/>
+        </w:rPr>
+        <w:t xml:space="preserve">           </w:t>
+      </w:r>
+      <w:r>
+        <w:rPr>
+          <w:rFonts w:ascii="Liberation Serif" w:hAnsi="Liberation Serif"/>
+          <w:color w:val="000000"/>
+          <w:sz w:val="24"/>
+          <w:szCs w:val="24"/>
+          <w:shd w:fill="auto" w:val="clear"/>
+        </w:rPr>
+        <w:t>Pillai's trace 0.0015 5.0000 2063.0000  0.5995 0.7004</w:t>
+      </w:r>
+    </w:p>
+    <w:p>
+      <w:pPr>
+        <w:pStyle w:val="Normal"/>
+        <w:spacing w:lineRule="atLeast" w:line="228"/>
+        <w:rPr>
+          <w:rFonts w:ascii="Liberation Serif" w:hAnsi="Liberation Serif"/>
+          <w:color w:val="000000"/>
+          <w:sz w:val="24"/>
+          <w:szCs w:val="24"/>
+          <w:highlight w:val="none"/>
+          <w:shd w:fill="auto" w:val="clear"/>
+        </w:rPr>
+      </w:pPr>
+      <w:r>
+        <w:rPr>
+          <w:rFonts w:ascii="Liberation Serif" w:hAnsi="Liberation Serif"/>
+          <w:color w:val="000000"/>
+          <w:sz w:val="24"/>
+          <w:szCs w:val="24"/>
+          <w:shd w:fill="auto" w:val="clear"/>
+        </w:rPr>
+        <w:t xml:space="preserve">   </w:t>
+      </w:r>
+      <w:r>
+        <w:rPr>
+          <w:rFonts w:ascii="Liberation Serif" w:hAnsi="Liberation Serif"/>
+          <w:color w:val="000000"/>
+          <w:sz w:val="24"/>
+          <w:szCs w:val="24"/>
+          <w:shd w:fill="auto" w:val="clear"/>
+        </w:rPr>
+        <w:t>Hotelling-Lawley trace 0.0015 5.0000 2063.0000  0.5995 0.7004</w:t>
+      </w:r>
+    </w:p>
+    <w:p>
+      <w:pPr>
+        <w:pStyle w:val="Normal"/>
+        <w:spacing w:lineRule="atLeast" w:line="228"/>
+        <w:rPr>
+          <w:rFonts w:ascii="Liberation Serif" w:hAnsi="Liberation Serif"/>
+          <w:color w:val="000000"/>
+          <w:sz w:val="24"/>
+          <w:szCs w:val="24"/>
+          <w:highlight w:val="none"/>
+          <w:shd w:fill="auto" w:val="clear"/>
+        </w:rPr>
+      </w:pPr>
+      <w:r>
+        <w:rPr>
+          <w:rFonts w:ascii="Liberation Serif" w:hAnsi="Liberation Serif"/>
+          <w:color w:val="000000"/>
+          <w:sz w:val="24"/>
+          <w:szCs w:val="24"/>
+          <w:shd w:fill="auto" w:val="clear"/>
+        </w:rPr>
+        <w:t xml:space="preserve">      </w:t>
+      </w:r>
+      <w:r>
+        <w:rPr>
+          <w:rFonts w:ascii="Liberation Serif" w:hAnsi="Liberation Serif"/>
+          <w:color w:val="000000"/>
+          <w:sz w:val="24"/>
+          <w:szCs w:val="24"/>
+          <w:shd w:fill="auto" w:val="clear"/>
+        </w:rPr>
+        <w:t>Roy's greatest root 0.0015 5.0000 2063.0000  0.5995 0.7004</w:t>
+      </w:r>
+    </w:p>
+    <w:p>
+      <w:pPr>
+        <w:pStyle w:val="Normal"/>
+        <w:spacing w:lineRule="atLeast" w:line="228"/>
+        <w:rPr>
+          <w:rFonts w:ascii="Liberation Serif" w:hAnsi="Liberation Serif"/>
+          <w:color w:val="000000"/>
+          <w:sz w:val="24"/>
+          <w:szCs w:val="24"/>
+          <w:highlight w:val="none"/>
+          <w:shd w:fill="auto" w:val="clear"/>
+        </w:rPr>
+      </w:pPr>
+      <w:r>
+        <w:rPr>
+          <w:rFonts w:ascii="Liberation Serif" w:hAnsi="Liberation Serif"/>
+          <w:color w:val="000000"/>
+          <w:sz w:val="24"/>
+          <w:szCs w:val="24"/>
+          <w:shd w:fill="auto" w:val="clear"/>
+        </w:rPr>
+        <w:t>----------------------------------------------------------------</w:t>
+      </w:r>
+    </w:p>
+    <w:p>
+      <w:pPr>
+        <w:pStyle w:val="Normal"/>
+        <w:spacing w:lineRule="atLeast" w:line="228"/>
+        <w:rPr>
+          <w:rFonts w:ascii="Liberation Serif" w:hAnsi="Liberation Serif"/>
+          <w:color w:val="000000"/>
+          <w:sz w:val="24"/>
+          <w:szCs w:val="24"/>
+          <w:highlight w:val="none"/>
+          <w:shd w:fill="auto" w:val="clear"/>
+        </w:rPr>
+      </w:pPr>
+      <w:r>
+        <w:rPr>
+          <w:rFonts w:ascii="Liberation Serif" w:hAnsi="Liberation Serif"/>
+          <w:color w:val="000000"/>
+          <w:sz w:val="24"/>
+          <w:szCs w:val="24"/>
+          <w:shd w:fill="auto" w:val="clear"/>
+        </w:rPr>
+        <w:t xml:space="preserve">                                                                </w:t>
+      </w:r>
+    </w:p>
+    <w:p>
+      <w:pPr>
+        <w:pStyle w:val="Normal"/>
+        <w:spacing w:lineRule="atLeast" w:line="228"/>
+        <w:rPr>
+          <w:rFonts w:ascii="Liberation Serif" w:hAnsi="Liberation Serif"/>
+          <w:color w:val="000000"/>
+          <w:sz w:val="24"/>
+          <w:szCs w:val="24"/>
+          <w:highlight w:val="none"/>
+          <w:shd w:fill="auto" w:val="clear"/>
+        </w:rPr>
+      </w:pPr>
+      <w:r>
+        <w:rPr>
+          <w:rFonts w:ascii="Liberation Serif" w:hAnsi="Liberation Serif"/>
+          <w:color w:val="000000"/>
+          <w:sz w:val="24"/>
+          <w:szCs w:val="24"/>
+          <w:shd w:fill="auto" w:val="clear"/>
+        </w:rPr>
+        <w:t>----------------------------------------------------------------</w:t>
+      </w:r>
+    </w:p>
+    <w:p>
+      <w:pPr>
+        <w:pStyle w:val="Normal"/>
+        <w:spacing w:lineRule="atLeast" w:line="228"/>
+        <w:rPr>
+          <w:rFonts w:ascii="Liberation Serif" w:hAnsi="Liberation Serif"/>
+          <w:color w:val="000000"/>
+          <w:sz w:val="24"/>
+          <w:szCs w:val="24"/>
+          <w:highlight w:val="none"/>
+          <w:shd w:fill="auto" w:val="clear"/>
+        </w:rPr>
+      </w:pPr>
+      <w:r>
+        <w:rPr>
+          <w:rFonts w:ascii="Liberation Serif" w:hAnsi="Liberation Serif"/>
+          <w:color w:val="000000"/>
+          <w:sz w:val="24"/>
+          <w:szCs w:val="24"/>
+          <w:shd w:fill="auto" w:val="clear"/>
+        </w:rPr>
+        <w:t xml:space="preserve">        </w:t>
+      </w:r>
+      <w:r>
+        <w:rPr>
+          <w:rFonts w:ascii="Liberation Serif" w:hAnsi="Liberation Serif"/>
+          <w:color w:val="000000"/>
+          <w:sz w:val="24"/>
+          <w:szCs w:val="24"/>
+          <w:shd w:fill="auto" w:val="clear"/>
+        </w:rPr>
+        <w:t>decile_10_G       Value  Num DF   Den DF  F Value Pr &gt; F</w:t>
+      </w:r>
+    </w:p>
+    <w:p>
+      <w:pPr>
+        <w:pStyle w:val="Normal"/>
+        <w:spacing w:lineRule="atLeast" w:line="228"/>
+        <w:rPr>
+          <w:rFonts w:ascii="Liberation Serif" w:hAnsi="Liberation Serif"/>
+          <w:color w:val="000000"/>
+          <w:sz w:val="24"/>
+          <w:szCs w:val="24"/>
+          <w:highlight w:val="none"/>
+          <w:shd w:fill="auto" w:val="clear"/>
+        </w:rPr>
+      </w:pPr>
+      <w:r>
+        <w:rPr>
+          <w:rFonts w:ascii="Liberation Serif" w:hAnsi="Liberation Serif"/>
+          <w:color w:val="000000"/>
+          <w:sz w:val="24"/>
+          <w:szCs w:val="24"/>
+          <w:shd w:fill="auto" w:val="clear"/>
+        </w:rPr>
+        <w:t>----------------------------------------------------------------</w:t>
+      </w:r>
+    </w:p>
+    <w:p>
+      <w:pPr>
+        <w:pStyle w:val="Normal"/>
+        <w:spacing w:lineRule="atLeast" w:line="228"/>
+        <w:rPr>
+          <w:rFonts w:ascii="Liberation Serif" w:hAnsi="Liberation Serif"/>
+          <w:color w:val="000000"/>
+          <w:sz w:val="24"/>
+          <w:szCs w:val="24"/>
+          <w:highlight w:val="none"/>
+          <w:shd w:fill="auto" w:val="clear"/>
+        </w:rPr>
+      </w:pPr>
+      <w:r>
+        <w:rPr>
+          <w:rFonts w:ascii="Liberation Serif" w:hAnsi="Liberation Serif"/>
+          <w:color w:val="000000"/>
+          <w:sz w:val="24"/>
+          <w:szCs w:val="24"/>
+          <w:shd w:fill="auto" w:val="clear"/>
+        </w:rPr>
+        <w:t xml:space="preserve">            </w:t>
+      </w:r>
+      <w:r>
+        <w:rPr>
+          <w:rFonts w:ascii="Liberation Serif" w:hAnsi="Liberation Serif"/>
+          <w:color w:val="000000"/>
+          <w:sz w:val="24"/>
+          <w:szCs w:val="24"/>
+          <w:shd w:fill="auto" w:val="clear"/>
+        </w:rPr>
+        <w:t>Wilks' lambda 0.9895 5.0000 2063.0000  4.3932 0.0006</w:t>
+      </w:r>
+    </w:p>
+    <w:p>
+      <w:pPr>
+        <w:pStyle w:val="Normal"/>
+        <w:spacing w:lineRule="atLeast" w:line="228"/>
+        <w:rPr>
+          <w:rFonts w:ascii="Liberation Serif" w:hAnsi="Liberation Serif"/>
+          <w:color w:val="000000"/>
+          <w:sz w:val="24"/>
+          <w:szCs w:val="24"/>
+          <w:highlight w:val="none"/>
+          <w:shd w:fill="auto" w:val="clear"/>
+        </w:rPr>
+      </w:pPr>
+      <w:r>
+        <w:rPr>
+          <w:rFonts w:ascii="Liberation Serif" w:hAnsi="Liberation Serif"/>
+          <w:color w:val="000000"/>
+          <w:sz w:val="24"/>
+          <w:szCs w:val="24"/>
+          <w:shd w:fill="auto" w:val="clear"/>
+        </w:rPr>
+        <w:t xml:space="preserve">           </w:t>
+      </w:r>
+      <w:r>
+        <w:rPr>
+          <w:rFonts w:ascii="Liberation Serif" w:hAnsi="Liberation Serif"/>
+          <w:color w:val="000000"/>
+          <w:sz w:val="24"/>
+          <w:szCs w:val="24"/>
+          <w:shd w:fill="auto" w:val="clear"/>
+        </w:rPr>
+        <w:t>Pillai's trace 0.0105 5.0000 2063.0000  4.3932 0.0006</w:t>
+      </w:r>
+    </w:p>
+    <w:p>
+      <w:pPr>
+        <w:pStyle w:val="Normal"/>
+        <w:spacing w:lineRule="atLeast" w:line="228"/>
+        <w:rPr>
+          <w:rFonts w:ascii="Liberation Serif" w:hAnsi="Liberation Serif"/>
+          <w:color w:val="000000"/>
+          <w:sz w:val="24"/>
+          <w:szCs w:val="24"/>
+          <w:highlight w:val="none"/>
+          <w:shd w:fill="auto" w:val="clear"/>
+        </w:rPr>
+      </w:pPr>
+      <w:r>
+        <w:rPr>
+          <w:rFonts w:ascii="Liberation Serif" w:hAnsi="Liberation Serif"/>
+          <w:color w:val="000000"/>
+          <w:sz w:val="24"/>
+          <w:szCs w:val="24"/>
+          <w:shd w:fill="auto" w:val="clear"/>
+        </w:rPr>
+        <w:t xml:space="preserve">   </w:t>
+      </w:r>
+      <w:r>
+        <w:rPr>
+          <w:rFonts w:ascii="Liberation Serif" w:hAnsi="Liberation Serif"/>
+          <w:color w:val="000000"/>
+          <w:sz w:val="24"/>
+          <w:szCs w:val="24"/>
+          <w:shd w:fill="auto" w:val="clear"/>
+        </w:rPr>
+        <w:t>Hotelling-Lawley trace 0.0106 5.0000 2063.0000  4.3932 0.0006</w:t>
+      </w:r>
+    </w:p>
+    <w:p>
+      <w:pPr>
+        <w:pStyle w:val="Normal"/>
+        <w:spacing w:lineRule="atLeast" w:line="228"/>
+        <w:rPr>
+          <w:rFonts w:ascii="Liberation Serif" w:hAnsi="Liberation Serif"/>
+          <w:color w:val="000000"/>
+          <w:sz w:val="24"/>
+          <w:szCs w:val="24"/>
+          <w:highlight w:val="none"/>
+          <w:shd w:fill="auto" w:val="clear"/>
+        </w:rPr>
+      </w:pPr>
+      <w:r>
+        <w:rPr>
+          <w:rFonts w:ascii="Liberation Serif" w:hAnsi="Liberation Serif"/>
+          <w:color w:val="000000"/>
+          <w:sz w:val="24"/>
+          <w:szCs w:val="24"/>
+          <w:shd w:fill="auto" w:val="clear"/>
+        </w:rPr>
+        <w:t xml:space="preserve">      </w:t>
+      </w:r>
+      <w:r>
+        <w:rPr>
+          <w:rFonts w:ascii="Liberation Serif" w:hAnsi="Liberation Serif"/>
+          <w:color w:val="000000"/>
+          <w:sz w:val="24"/>
+          <w:szCs w:val="24"/>
+          <w:shd w:fill="auto" w:val="clear"/>
+        </w:rPr>
+        <w:t>Roy's greatest root 0.0106 5.0000 2063.0000  4.3932 0.0006</w:t>
+      </w:r>
+    </w:p>
+    <w:p>
+      <w:pPr>
+        <w:pStyle w:val="Normal"/>
+        <w:spacing w:lineRule="atLeast" w:line="228"/>
+        <w:rPr>
+          <w:rFonts w:ascii="Liberation Serif" w:hAnsi="Liberation Serif"/>
+          <w:color w:val="000000"/>
+          <w:sz w:val="24"/>
+          <w:szCs w:val="24"/>
+          <w:highlight w:val="none"/>
+          <w:shd w:fill="auto" w:val="clear"/>
+        </w:rPr>
+      </w:pPr>
+      <w:r>
+        <w:rPr>
+          <w:rFonts w:ascii="Liberation Serif" w:hAnsi="Liberation Serif"/>
+          <w:color w:val="000000"/>
+          <w:sz w:val="24"/>
+          <w:szCs w:val="24"/>
+          <w:shd w:fill="auto" w:val="clear"/>
+        </w:rPr>
+        <w:t>----------------------------------------------------------------</w:t>
+      </w:r>
+    </w:p>
+    <w:p>
+      <w:pPr>
+        <w:pStyle w:val="Normal"/>
+        <w:spacing w:lineRule="atLeast" w:line="228"/>
+        <w:rPr>
+          <w:rFonts w:ascii="Liberation Serif" w:hAnsi="Liberation Serif"/>
+          <w:color w:val="000000"/>
+          <w:sz w:val="24"/>
+          <w:szCs w:val="24"/>
+          <w:highlight w:val="none"/>
+          <w:shd w:fill="auto" w:val="clear"/>
+        </w:rPr>
+      </w:pPr>
+      <w:r>
+        <w:rPr>
+          <w:rFonts w:ascii="Liberation Serif" w:hAnsi="Liberation Serif"/>
+          <w:color w:val="000000"/>
+          <w:sz w:val="24"/>
+          <w:szCs w:val="24"/>
+          <w:shd w:fill="auto" w:val="clear"/>
+        </w:rPr>
+        <w:t xml:space="preserve">                                                                </w:t>
+      </w:r>
+    </w:p>
+    <w:p>
+      <w:pPr>
+        <w:pStyle w:val="Normal"/>
+        <w:spacing w:lineRule="atLeast" w:line="228"/>
+        <w:rPr>
+          <w:rFonts w:ascii="Liberation Serif" w:hAnsi="Liberation Serif"/>
+          <w:color w:val="000000"/>
+          <w:sz w:val="24"/>
+          <w:szCs w:val="24"/>
+          <w:highlight w:val="none"/>
+          <w:shd w:fill="auto" w:val="clear"/>
+        </w:rPr>
+      </w:pPr>
+      <w:r>
+        <w:rPr>
+          <w:rFonts w:ascii="Liberation Serif" w:hAnsi="Liberation Serif"/>
+          <w:color w:val="000000"/>
+          <w:sz w:val="24"/>
+          <w:szCs w:val="24"/>
+          <w:shd w:fill="auto" w:val="clear"/>
+        </w:rPr>
+        <w:t>----------------------------------------------------------------</w:t>
+      </w:r>
+    </w:p>
+    <w:p>
+      <w:pPr>
+        <w:pStyle w:val="Normal"/>
+        <w:spacing w:lineRule="atLeast" w:line="228"/>
+        <w:rPr>
+          <w:rFonts w:ascii="Liberation Serif" w:hAnsi="Liberation Serif"/>
+          <w:color w:val="000000"/>
+          <w:sz w:val="24"/>
+          <w:szCs w:val="24"/>
+          <w:highlight w:val="none"/>
+          <w:shd w:fill="auto" w:val="clear"/>
+        </w:rPr>
+      </w:pPr>
+      <w:r>
+        <w:rPr>
+          <w:rFonts w:ascii="Liberation Serif" w:hAnsi="Liberation Serif"/>
+          <w:color w:val="000000"/>
+          <w:sz w:val="24"/>
+          <w:szCs w:val="24"/>
+          <w:shd w:fill="auto" w:val="clear"/>
+        </w:rPr>
+        <w:t xml:space="preserve">       </w:t>
+      </w:r>
+      <w:r>
+        <w:rPr>
+          <w:rFonts w:ascii="Liberation Serif" w:hAnsi="Liberation Serif"/>
+          <w:color w:val="000000"/>
+          <w:sz w:val="24"/>
+          <w:szCs w:val="24"/>
+          <w:shd w:fill="auto" w:val="clear"/>
+        </w:rPr>
+        <w:t>quartile_25_G      Value  Num DF   Den DF  F Value Pr &gt; F</w:t>
+      </w:r>
+    </w:p>
+    <w:p>
+      <w:pPr>
+        <w:pStyle w:val="Normal"/>
+        <w:spacing w:lineRule="atLeast" w:line="228"/>
+        <w:rPr>
+          <w:rFonts w:ascii="Liberation Serif" w:hAnsi="Liberation Serif"/>
+          <w:color w:val="000000"/>
+          <w:sz w:val="24"/>
+          <w:szCs w:val="24"/>
+          <w:highlight w:val="none"/>
+          <w:shd w:fill="auto" w:val="clear"/>
+        </w:rPr>
+      </w:pPr>
+      <w:r>
+        <w:rPr>
+          <w:rFonts w:ascii="Liberation Serif" w:hAnsi="Liberation Serif"/>
+          <w:color w:val="000000"/>
+          <w:sz w:val="24"/>
+          <w:szCs w:val="24"/>
+          <w:shd w:fill="auto" w:val="clear"/>
+        </w:rPr>
+        <w:t>----------------------------------------------------------------</w:t>
+      </w:r>
+    </w:p>
+    <w:p>
+      <w:pPr>
+        <w:pStyle w:val="Normal"/>
+        <w:spacing w:lineRule="atLeast" w:line="228"/>
+        <w:rPr>
+          <w:rFonts w:ascii="Liberation Serif" w:hAnsi="Liberation Serif"/>
+          <w:color w:val="000000"/>
+          <w:sz w:val="24"/>
+          <w:szCs w:val="24"/>
+          <w:highlight w:val="none"/>
+          <w:shd w:fill="auto" w:val="clear"/>
+        </w:rPr>
+      </w:pPr>
+      <w:r>
+        <w:rPr>
+          <w:rFonts w:ascii="Liberation Serif" w:hAnsi="Liberation Serif"/>
+          <w:color w:val="000000"/>
+          <w:sz w:val="24"/>
+          <w:szCs w:val="24"/>
+          <w:shd w:fill="auto" w:val="clear"/>
+        </w:rPr>
+        <w:t xml:space="preserve">            </w:t>
+      </w:r>
+      <w:r>
+        <w:rPr>
+          <w:rFonts w:ascii="Liberation Serif" w:hAnsi="Liberation Serif"/>
+          <w:color w:val="000000"/>
+          <w:sz w:val="24"/>
+          <w:szCs w:val="24"/>
+          <w:shd w:fill="auto" w:val="clear"/>
+        </w:rPr>
+        <w:t>Wilks' lambda 0.9987 5.0000 2063.0000  0.5181 0.7627</w:t>
+      </w:r>
+    </w:p>
+    <w:p>
+      <w:pPr>
+        <w:pStyle w:val="Normal"/>
+        <w:spacing w:lineRule="atLeast" w:line="228"/>
+        <w:rPr>
+          <w:rFonts w:ascii="Liberation Serif" w:hAnsi="Liberation Serif"/>
+          <w:color w:val="000000"/>
+          <w:sz w:val="24"/>
+          <w:szCs w:val="24"/>
+          <w:highlight w:val="none"/>
+          <w:shd w:fill="auto" w:val="clear"/>
+        </w:rPr>
+      </w:pPr>
+      <w:r>
+        <w:rPr>
+          <w:rFonts w:ascii="Liberation Serif" w:hAnsi="Liberation Serif"/>
+          <w:color w:val="000000"/>
+          <w:sz w:val="24"/>
+          <w:szCs w:val="24"/>
+          <w:shd w:fill="auto" w:val="clear"/>
+        </w:rPr>
+        <w:t xml:space="preserve">           </w:t>
+      </w:r>
+      <w:r>
+        <w:rPr>
+          <w:rFonts w:ascii="Liberation Serif" w:hAnsi="Liberation Serif"/>
+          <w:color w:val="000000"/>
+          <w:sz w:val="24"/>
+          <w:szCs w:val="24"/>
+          <w:shd w:fill="auto" w:val="clear"/>
+        </w:rPr>
+        <w:t>Pillai's trace 0.0013 5.0000 2063.0000  0.5181 0.7627</w:t>
+      </w:r>
+    </w:p>
+    <w:p>
+      <w:pPr>
+        <w:pStyle w:val="Normal"/>
+        <w:spacing w:lineRule="atLeast" w:line="228"/>
+        <w:rPr>
+          <w:rFonts w:ascii="Liberation Serif" w:hAnsi="Liberation Serif"/>
+          <w:color w:val="000000"/>
+          <w:sz w:val="24"/>
+          <w:szCs w:val="24"/>
+          <w:highlight w:val="none"/>
+          <w:shd w:fill="auto" w:val="clear"/>
+        </w:rPr>
+      </w:pPr>
+      <w:r>
+        <w:rPr>
+          <w:rFonts w:ascii="Liberation Serif" w:hAnsi="Liberation Serif"/>
+          <w:color w:val="000000"/>
+          <w:sz w:val="24"/>
+          <w:szCs w:val="24"/>
+          <w:shd w:fill="auto" w:val="clear"/>
+        </w:rPr>
+        <w:t xml:space="preserve">   </w:t>
+      </w:r>
+      <w:r>
+        <w:rPr>
+          <w:rFonts w:ascii="Liberation Serif" w:hAnsi="Liberation Serif"/>
+          <w:color w:val="000000"/>
+          <w:sz w:val="24"/>
+          <w:szCs w:val="24"/>
+          <w:shd w:fill="auto" w:val="clear"/>
+        </w:rPr>
+        <w:t>Hotelling-Lawley trace 0.0013 5.0000 2063.0000  0.5181 0.7627</w:t>
+      </w:r>
+    </w:p>
+    <w:p>
+      <w:pPr>
+        <w:pStyle w:val="Normal"/>
+        <w:spacing w:lineRule="atLeast" w:line="228"/>
+        <w:rPr>
+          <w:rFonts w:ascii="Liberation Serif" w:hAnsi="Liberation Serif"/>
+          <w:color w:val="000000"/>
+          <w:sz w:val="24"/>
+          <w:szCs w:val="24"/>
+          <w:highlight w:val="none"/>
+          <w:shd w:fill="auto" w:val="clear"/>
+        </w:rPr>
+      </w:pPr>
+      <w:r>
+        <w:rPr>
+          <w:rFonts w:ascii="Liberation Serif" w:hAnsi="Liberation Serif"/>
+          <w:color w:val="000000"/>
+          <w:sz w:val="24"/>
+          <w:szCs w:val="24"/>
+          <w:shd w:fill="auto" w:val="clear"/>
+        </w:rPr>
+        <w:t xml:space="preserve">      </w:t>
+      </w:r>
+      <w:r>
+        <w:rPr>
+          <w:rFonts w:ascii="Liberation Serif" w:hAnsi="Liberation Serif"/>
+          <w:color w:val="000000"/>
+          <w:sz w:val="24"/>
+          <w:szCs w:val="24"/>
+          <w:shd w:fill="auto" w:val="clear"/>
+        </w:rPr>
+        <w:t>Roy's greatest root 0.0013 5.0000 2063.0000  0.5181 0.7627</w:t>
+      </w:r>
+    </w:p>
+    <w:p>
+      <w:pPr>
+        <w:pStyle w:val="Normal"/>
+        <w:spacing w:lineRule="atLeast" w:line="228"/>
+        <w:rPr>
+          <w:rFonts w:ascii="Liberation Serif" w:hAnsi="Liberation Serif"/>
+          <w:color w:val="000000"/>
+          <w:sz w:val="24"/>
+          <w:szCs w:val="24"/>
+          <w:highlight w:val="none"/>
+          <w:shd w:fill="auto" w:val="clear"/>
+        </w:rPr>
+      </w:pPr>
+      <w:r>
+        <w:rPr>
+          <w:rFonts w:ascii="Liberation Serif" w:hAnsi="Liberation Serif"/>
+          <w:color w:val="000000"/>
+          <w:sz w:val="24"/>
+          <w:szCs w:val="24"/>
+          <w:shd w:fill="auto" w:val="clear"/>
+        </w:rPr>
+        <w:t>================================================================</w:t>
+      </w:r>
+    </w:p>
+    <w:p>
+      <w:pPr>
+        <w:pStyle w:val="Normal"/>
+        <w:spacing w:lineRule="atLeast" w:line="228"/>
+        <w:rPr>
+          <w:rFonts w:ascii="Liberation Serif" w:hAnsi="Liberation Serif"/>
+          <w:color w:val="000000"/>
+          <w:sz w:val="24"/>
+          <w:szCs w:val="24"/>
+          <w:highlight w:val="none"/>
+          <w:shd w:fill="auto" w:val="clear"/>
+        </w:rPr>
+      </w:pPr>
+      <w:r>
+        <w:rPr>
+          <w:rFonts w:ascii="Liberation Serif" w:hAnsi="Liberation Serif"/>
+          <w:color w:val="000000"/>
+          <w:sz w:val="24"/>
+          <w:szCs w:val="24"/>
+          <w:shd w:fill="auto" w:val="clear"/>
+        </w:rPr>
+      </w:r>
+    </w:p>
+    <w:p>
+      <w:pPr>
+        <w:pStyle w:val="Normal"/>
+        <w:spacing w:lineRule="atLeast" w:line="228"/>
+        <w:rPr/>
+      </w:pPr>
+      <w:r>
+        <w:rPr/>
+        <w:t xml:space="preserve">Notes: </w:t>
+      </w:r>
+    </w:p>
+    <w:p>
+      <w:pPr>
+        <w:pStyle w:val="Heading2"/>
+        <w:numPr>
+          <w:ilvl w:val="1"/>
+          <w:numId w:val="2"/>
+        </w:numPr>
+        <w:bidi w:val="0"/>
+        <w:jc w:val="left"/>
+        <w:rPr/>
+      </w:pPr>
+      <w:r>
+        <w:rPr/>
+        <w:t>Visuals:</w:t>
+      </w:r>
+    </w:p>
+    <w:p>
+      <w:pPr>
+        <w:pStyle w:val="TextBody"/>
+        <w:bidi w:val="0"/>
+        <w:jc w:val="left"/>
+        <w:rPr/>
+      </w:pPr>
+      <w:r>
+        <w:rPr/>
+        <w:tab/>
+        <w:t xml:space="preserve">Visuals are accessible </w:t>
+      </w:r>
+      <w:r>
+        <w:rPr/>
+        <w:t xml:space="preserve">via the photos folder in the Github as well as the local version. Figures 1 through 36 is a comparison of a variable against one of the four HOLC grades. Those variables include the percentages by race as well as the percentage change range. The </w:t>
+      </w:r>
+      <w:r>
+        <w:rPr/>
+        <w:t xml:space="preserve">white population had greater </w:t>
+      </w:r>
+      <w:r>
+        <w:rPr/>
+        <w:t>proportions in Grade A compared to other rac</w:t>
+      </w:r>
+      <w:r>
+        <w:rPr/>
+        <w:t>ial groups</w:t>
+      </w:r>
+      <w:r>
+        <w:rPr/>
+        <w:t xml:space="preserve">. As the grade goes down, all the racial demographics become more spread out. </w:t>
+      </w:r>
+    </w:p>
+    <w:p>
+      <w:pPr>
+        <w:pStyle w:val="TextBody"/>
+        <w:bidi w:val="0"/>
+        <w:jc w:val="left"/>
+        <w:rPr/>
+      </w:pPr>
+      <w:r>
+        <w:rPr/>
+        <w:tab/>
+        <w:t xml:space="preserve">Figures 37 to 101 compare all relevant variables against the surrounding area racial composition. </w:t>
+      </w:r>
+      <w:r>
+        <w:rPr/>
+        <w:t xml:space="preserve">With the percentage of white people in surrounding areas increase, so does the probability that the white population also increases, while the black population percentage decreases, and all other races are generally constant regardless. In contrast, there is an inverse relationship between the proportion of black people in the surrounding areas and the proportion of white people in an area. </w:t>
+      </w:r>
+      <w:r>
+        <w:rPr/>
+        <w:t xml:space="preserve">The proportion is direct with the proportion of black people and constant with all other racial groups. With the proportion of Hispanic people in surrounding areas, the proportion of white people increases, while other races’ proportion increases except for the other racial demographic. This also goes for the proportion of Asian people in surrounding areas. With the proportion of other races in surrounding areas, the proportions of other races is constant, save for white people, where it decreases only slightly, and the other racial demographic, </w:t>
+      </w:r>
+      <w:r>
+        <w:rPr/>
+        <w:t xml:space="preserve">where there is a strong positive relationship. </w:t>
+      </w:r>
+    </w:p>
+    <w:p>
+      <w:pPr>
+        <w:pStyle w:val="TextBody"/>
+        <w:bidi w:val="0"/>
+        <w:jc w:val="left"/>
+        <w:rPr/>
+      </w:pPr>
+      <w:r>
+        <w:rPr/>
+        <w:tab/>
+      </w:r>
+      <w:r>
+        <w:rPr/>
+        <w:t>One thing of note is that there seems to be little use in looking into the percentage change, potentially because of the attempt to generalize information.</w:t>
+      </w:r>
+    </w:p>
+    <w:p>
+      <w:pPr>
+        <w:pStyle w:val="TextBody"/>
+        <w:bidi w:val="0"/>
+        <w:jc w:val="left"/>
         <w:rPr/>
       </w:pPr>
       <w:r>

</xml_diff>

<commit_message>
Saved doc file and added video
Likely to be final version
</commit_message>
<xml_diff>
--- a/Project - Olga Ivashyna.docx
+++ b/Project - Olga Ivashyna.docx
@@ -411,7 +411,23 @@
       <w:r>
         <w:rPr/>
         <w:tab/>
-        <w:t>Redlining has had a vast impact on the history of the United States and on the current demographics. For those uninitiated, redlining can be defined as the real estate practice  of assigning areas or neighborhood with a four-letter system (from “A” for “Best” to “D” for “Hazardous”) and using that system as a mechanism of essentially assigning people of different races to different areas, with the end result being that racial minorities ended up living in worse areas.</w:t>
+        <w:t>Redlining has had a vast impact on the history of the United States and on the current demographics. For those uninitiated, redlining can be defined as the real estate practice of assigning areas or neighborhood</w:t>
+      </w:r>
+      <w:r>
+        <w:rPr/>
+        <w:t xml:space="preserve">s a letter </w:t>
+      </w:r>
+      <w:r>
+        <w:rPr/>
+        <w:t>with</w:t>
+      </w:r>
+      <w:r>
+        <w:rPr/>
+        <w:t>in</w:t>
+      </w:r>
+      <w:r>
+        <w:rPr/>
+        <w:t xml:space="preserve"> a four-letter system (from “A” for “Best” to “D” for “Hazardous”) and using that system as a mechanism of essentially assigning people of different races to different areas, with the end result being that racial minorities ended up living in worse areas.</w:t>
       </w:r>
     </w:p>
     <w:p>
@@ -437,7 +453,11 @@
       <w:r>
         <w:rPr/>
         <w:tab/>
-        <w:t>The questions this paper is interested in asking as follows: can the racial demographics of an area be predicted based on the HOLC grade of an area and the racial demographics of surrounding areas, and is there a significant overlap in racial compositions between 2020 and the time of the HOLC’s peak? The outcome variable for the first question will be the percentages of different races living in an area and the paper will be using the percentages of surrounding areas and the HOLC grade as the predictors. The second question will being looking into the outcome of the 2020 percentage comparison using he percentages of surrounding areas, the HOLC grade and the location quotient and the as predictors.</w:t>
+        <w:t xml:space="preserve">The questions this paper is interested in asking as follows: can the racial demographics of an area be predicted based on the HOLC grade of an area and the racial demographics of surrounding areas, and is there a significant overlap in racial compositions between 2020 and the time of the HOLC’s peak? The outcome variable for the first question will be the percentages of different races living in an area and the paper will be using the percentages of surrounding areas and the HOLC grade as the predictors. </w:t>
+      </w:r>
+      <w:r>
+        <w:rPr/>
+        <w:t>The second question will also use 2020 census percentages as the predictors of racial composition.</w:t>
       </w:r>
     </w:p>
     <w:p>

</xml_diff>